<commit_message>
Weitere Vereinfachungen und sprachliche Verbesserungen
</commit_message>
<xml_diff>
--- a/docs/confluence/Benutzeranleitung.docx
+++ b/docs/confluence/Benutzeranleitung.docx
@@ -2,7 +2,7 @@
 <file path=word/document.xml><?xml version="1.0" encoding="utf-8"?>
 <w:document xmlns:w="http://schemas.openxmlformats.org/wordprocessingml/2006/main" xmlns:m="http://schemas.openxmlformats.org/officeDocument/2006/math" xmlns:r="http://schemas.openxmlformats.org/officeDocument/2006/relationships" xmlns:o="urn:schemas-microsoft-com:office:office" xmlns:v="urn:schemas-microsoft-com:vml" xmlns:w10="urn:schemas-microsoft-com:office:word" xmlns:a="http://schemas.openxmlformats.org/drawingml/2006/main" xmlns:pic="http://schemas.openxmlformats.org/drawingml/2006/picture" xmlns:wp="http://schemas.openxmlformats.org/drawingml/2006/wordprocessingDrawing">
   <w:body>
-    <w:bookmarkStart w:id="26" w:name="X5767fe00d06021c73500f578850dd0563b4d425"/>
+    <w:bookmarkStart w:id="27" w:name="X5767fe00d06021c73500f578850dd0563b4d425"/>
     <w:p>
       <w:pPr>
         <w:pStyle w:val="Heading1"/>
@@ -14,48 +14,6 @@
     <w:p>
       <w:pPr>
         <w:pStyle w:val="FirstParagraph"/>
-      </w:pPr>
-      <w:r>
-        <w:rPr>
-          <w:b/>
-          <w:bCs/>
-        </w:rPr>
-        <w:t xml:space="preserve">Stand:</w:t>
-      </w:r>
-      <w:r>
-        <w:t xml:space="preserve"> </w:t>
-      </w:r>
-      <w:r>
-        <w:t xml:space="preserve">15. Juli 2026</w:t>
-      </w:r>
-    </w:p>
-    <w:p>
-      <w:pPr>
-        <w:pStyle w:val="BodyText"/>
-      </w:pPr>
-      <w:r>
-        <w:rPr>
-          <w:b/>
-          <w:bCs/>
-        </w:rPr>
-        <w:t xml:space="preserve">Zielgruppe:</w:t>
-      </w:r>
-      <w:r>
-        <w:t xml:space="preserve"> </w:t>
-      </w:r>
-      <w:r>
-        <w:t xml:space="preserve">Ressourcenautoren, Release-Verantwortliche, Freigebende und</w:t>
-      </w:r>
-      <w:r>
-        <w:t xml:space="preserve"> </w:t>
-      </w:r>
-      <w:r>
-        <w:t xml:space="preserve">Betrieb</w:t>
-      </w:r>
-    </w:p>
-    <w:p>
-      <w:pPr>
-        <w:pStyle w:val="BodyText"/>
       </w:pPr>
       <w:r>
         <w:rPr>
@@ -89,6 +47,44 @@
           <w:t xml:space="preserve">Soll-Grafik</w:t>
         </w:r>
       </w:hyperlink>
+    </w:p>
+    <w:bookmarkStart w:id="11" w:name="X2788b6074c097b73d1ba978dbc7910d1f387bb7"/>
+    <w:p>
+      <w:pPr>
+        <w:pStyle w:val="Heading2"/>
+      </w:pPr>
+      <w:r>
+        <w:t xml:space="preserve">1. Zweck</w:t>
+      </w:r>
+    </w:p>
+    <w:p>
+      <w:pPr>
+        <w:pStyle w:val="FirstParagraph"/>
+      </w:pPr>
+      <w:r>
+        <w:t xml:space="preserve">Die Lösung führt M/Text-Ressourcen eines Mandanten über die drei Stufen</w:t>
+      </w:r>
+      <w:r>
+        <w:t xml:space="preserve"> </w:t>
+      </w:r>
+      <w:r>
+        <w:rPr>
+          <w:rStyle w:val="VerbatimChar"/>
+        </w:rPr>
+        <w:t xml:space="preserve">Entwicklung</w:t>
+      </w:r>
+      <w:r>
+        <w:t xml:space="preserve">,</w:t>
+      </w:r>
+      <w:r>
+        <w:t xml:space="preserve"> </w:t>
+      </w:r>
+      <w:r>
+        <w:rPr>
+          <w:rStyle w:val="VerbatimChar"/>
+        </w:rPr>
+        <w:t xml:space="preserve">Abnahme</w:t>
+      </w:r>
       <w:r>
         <w:t xml:space="preserve"> </w:t>
       </w:r>
@@ -98,219 +94,60 @@
       <w:r>
         <w:t xml:space="preserve"> </w:t>
       </w:r>
-      <w:hyperlink r:id="rId11">
-        <w:r>
-          <w:rPr>
-            <w:rStyle w:val="Hyperlink"/>
-          </w:rPr>
-          <w:t xml:space="preserve">offene Aktivierungsschritte</w:t>
-        </w:r>
-      </w:hyperlink>
-    </w:p>
-    <w:bookmarkStart w:id="12" w:name="Xf0fb005875fdc84e61f3be53d81a3551716c31f"/>
+      <w:r>
+        <w:rPr>
+          <w:rStyle w:val="VerbatimChar"/>
+        </w:rPr>
+        <w:t xml:space="preserve">Bereitstellung</w:t>
+      </w:r>
+      <w:r>
+        <w:t xml:space="preserve">. Pushes nach Entwicklung und</w:t>
+      </w:r>
+      <w:r>
+        <w:t xml:space="preserve"> </w:t>
+      </w:r>
+      <w:r>
+        <w:t xml:space="preserve">Abnahme lösen die jeweilige M/Text-Synchronisation aus. Der Push nach</w:t>
+      </w:r>
+      <w:r>
+        <w:t xml:space="preserve"> </w:t>
+      </w:r>
+      <w:r>
+        <w:t xml:space="preserve">Bereitstellung liefert noch nichts aus; erst ein Release-Tag startet eine FULL</w:t>
+      </w:r>
+      <w:r>
+        <w:t xml:space="preserve"> </w:t>
+      </w:r>
+      <w:r>
+        <w:t xml:space="preserve">oder DELTA Lieferung via der nachgelagerten Mainframe-Übergabe an die IZE9.</w:t>
+      </w:r>
+    </w:p>
+    <w:bookmarkEnd w:id="11"/>
+    <w:bookmarkStart w:id="12" w:name="X8ad86c8517593dc1a6272a3f1e3a067ed470d53"/>
     <w:p>
       <w:pPr>
         <w:pStyle w:val="Heading2"/>
       </w:pPr>
       <w:r>
-        <w:t xml:space="preserve">1. Zweck und aktueller Betriebsstatus</w:t>
+        <w:t xml:space="preserve">2. Rollen und Berechtigungen</w:t>
       </w:r>
     </w:p>
     <w:p>
       <w:pPr>
         <w:pStyle w:val="FirstParagraph"/>
       </w:pPr>
-      <w:r>
-        <w:t xml:space="preserve">Die Lösung führt M/Text-Ressourcen eines Mandanten über die drei Stufen</w:t>
-      </w:r>
-      <w:r>
-        <w:t xml:space="preserve"> </w:t>
-      </w:r>
-      <w:r>
-        <w:rPr>
-          <w:rStyle w:val="VerbatimChar"/>
-        </w:rPr>
-        <w:t xml:space="preserve">Entwicklung</w:t>
-      </w:r>
-      <w:r>
-        <w:t xml:space="preserve">,</w:t>
-      </w:r>
-      <w:r>
-        <w:t xml:space="preserve"> </w:t>
-      </w:r>
-      <w:r>
-        <w:rPr>
-          <w:rStyle w:val="VerbatimChar"/>
-        </w:rPr>
-        <w:t xml:space="preserve">Abnahme</w:t>
-      </w:r>
-      <w:r>
-        <w:t xml:space="preserve"> </w:t>
-      </w:r>
-      <w:r>
-        <w:t xml:space="preserve">und</w:t>
-      </w:r>
-      <w:r>
-        <w:t xml:space="preserve"> </w:t>
-      </w:r>
-      <w:r>
-        <w:rPr>
-          <w:rStyle w:val="VerbatimChar"/>
-        </w:rPr>
-        <w:t xml:space="preserve">Bereitstellung</w:t>
-      </w:r>
-      <w:r>
-        <w:t xml:space="preserve">. Pushes nach Entwicklung und</w:t>
-      </w:r>
-      <w:r>
-        <w:t xml:space="preserve"> </w:t>
-      </w:r>
-      <w:r>
-        <w:t xml:space="preserve">Abnahme lösen die jeweilige M/Text-Synchronisation aus. Nur der Pull Request</w:t>
-      </w:r>
-      <w:r>
-        <w:t xml:space="preserve"> </w:t>
-      </w:r>
-      <w:r>
-        <w:t xml:space="preserve">nach Bereitstellung prüft den Auswahlbranch vor dem Merge. Ein Merge nach</w:t>
-      </w:r>
-      <w:r>
-        <w:t xml:space="preserve"> </w:t>
-      </w:r>
-      <w:r>
-        <w:t xml:space="preserve">Bereitstellung liefert noch nichts aus; erst ein Release-Tag startet FULL oder</w:t>
-      </w:r>
-      <w:r>
-        <w:t xml:space="preserve"> </w:t>
-      </w:r>
-      <w:r>
-        <w:t xml:space="preserve">DELTA und die nachgelagerte Mainframe-Übergabe.</w:t>
-      </w:r>
-    </w:p>
-    <w:p>
-      <w:pPr>
-        <w:pStyle w:val="BodyText"/>
-      </w:pPr>
-      <w:r>
-        <w:t xml:space="preserve">Der Stand im gemeinsamen Workspace ist noch</w:t>
-      </w:r>
-      <w:r>
-        <w:t xml:space="preserve"> </w:t>
-      </w:r>
       <w:r>
         <w:rPr>
           <w:b/>
           <w:bCs/>
         </w:rPr>
-        <w:t xml:space="preserve">nicht aktiviert</w:t>
-      </w:r>
-      <w:r>
-        <w:t xml:space="preserve">:</w:t>
-      </w:r>
-    </w:p>
-    <w:p>
-      <w:pPr>
-        <w:pStyle w:val="Compact"/>
-        <w:numPr>
-          <w:ilvl w:val="0"/>
-          <w:numId w:val="1001"/>
-        </w:numPr>
-      </w:pPr>
-      <w:r>
-        <w:t xml:space="preserve">die drei Mandantenworkflows referenzieren absichtlich einen nicht</w:t>
-      </w:r>
-      <w:r>
-        <w:t xml:space="preserve"> </w:t>
-      </w:r>
-      <w:r>
-        <w:t xml:space="preserve">auflösbaren Null-SHA der zentralen Automatisierung;</w:t>
-      </w:r>
-    </w:p>
-    <w:p>
-      <w:pPr>
-        <w:pStyle w:val="Compact"/>
-        <w:numPr>
-          <w:ilvl w:val="0"/>
-          <w:numId w:val="1001"/>
-        </w:numPr>
-      </w:pPr>
-      <w:r>
-        <w:rPr>
-          <w:rStyle w:val="VerbatimChar"/>
-        </w:rPr>
-        <w:t xml:space="preserve">serverSync</w:t>
-      </w:r>
-      <w:r>
-        <w:t xml:space="preserve">, Adapter und Mainframe sind zusätzlich durch drei auf</w:t>
-      </w:r>
-      <w:r>
-        <w:t xml:space="preserve"> </w:t>
-      </w:r>
-      <w:r>
-        <w:rPr>
-          <w:rStyle w:val="VerbatimChar"/>
-        </w:rPr>
-        <w:t xml:space="preserve">false</w:t>
-      </w:r>
-      <w:r>
-        <w:t xml:space="preserve"> </w:t>
-      </w:r>
-      <w:r>
-        <w:t xml:space="preserve">stehende Vertragsschalter gesperrt;</w:t>
-      </w:r>
-    </w:p>
-    <w:p>
-      <w:pPr>
-        <w:pStyle w:val="Compact"/>
-        <w:numPr>
-          <w:ilvl w:val="0"/>
-          <w:numId w:val="1001"/>
-        </w:numPr>
-      </w:pPr>
-      <w:r>
-        <w:t xml:space="preserve">Runner, Environments, Secrets, Branchrulesets und externe Verträge müssen</w:t>
-      </w:r>
-      <w:r>
-        <w:t xml:space="preserve"> </w:t>
-      </w:r>
-      <w:r>
-        <w:t xml:space="preserve">vor der Nutzung gemäß „Nächste Schritte“ eingerichtet und abgenommen werden.</w:t>
-      </w:r>
-    </w:p>
-    <w:p>
-      <w:pPr>
-        <w:pStyle w:val="FirstParagraph"/>
-      </w:pPr>
-      <w:r>
-        <w:t xml:space="preserve">Solange diese Sperren bestehen, darf diese Anleitung nur für Vorbereitung,</w:t>
-      </w:r>
-      <w:r>
-        <w:t xml:space="preserve"> </w:t>
-      </w:r>
-      <w:r>
-        <w:t xml:space="preserve">Schulung und lokale nebenwirkungsfreie Tests verwendet werden. Ein roter Lauf</w:t>
-      </w:r>
-      <w:r>
-        <w:t xml:space="preserve"> </w:t>
-      </w:r>
-      <w:r>
-        <w:t xml:space="preserve">wegen Null-SHA oder deaktiviertem Vertrag ist in diesem Zustand erwartetes</w:t>
-      </w:r>
-      <w:r>
-        <w:t xml:space="preserve"> </w:t>
-      </w:r>
-      <w:r>
-        <w:t xml:space="preserve">Schutzverhalten.</w:t>
-      </w:r>
-    </w:p>
-    <w:bookmarkEnd w:id="12"/>
-    <w:bookmarkStart w:id="13" w:name="X8ad86c8517593dc1a6272a3f1e3a067ed470d53"/>
-    <w:p>
-      <w:pPr>
-        <w:pStyle w:val="Heading2"/>
-      </w:pPr>
-      <w:r>
-        <w:t xml:space="preserve">2. Rollen und Berechtigungen</w:t>
+        <w:t xml:space="preserve">TODO</w:t>
+      </w:r>
+      <w:r>
+        <w:t xml:space="preserve"> </w:t>
+      </w:r>
+      <w:r>
+        <w:t xml:space="preserve">ggf. Löschen</w:t>
       </w:r>
     </w:p>
     <w:tbl>
@@ -416,18 +253,18 @@
               <w:pStyle w:val="Compact"/>
             </w:pPr>
             <w:r>
-              <w:t xml:space="preserve">Nach Abnahme Auswahlbranch erstellen, Bereitstellung mergen und Tag setzen</w:t>
-            </w:r>
-          </w:p>
-        </w:tc>
-        <w:tc>
-          <w:tcPr/>
-          <w:p>
-            <w:pPr>
-              <w:pStyle w:val="Compact"/>
-            </w:pPr>
-            <w:r>
-              <w:t xml:space="preserve">Branch erstellen, Pull Request mergen, Tag pushen</w:t>
+              <w:t xml:space="preserve">Freigegebene Änderungen nach Bereitstellung pushen und den Release-Tag setzen</w:t>
+            </w:r>
+          </w:p>
+        </w:tc>
+        <w:tc>
+          <w:tcPr/>
+          <w:p>
+            <w:pPr>
+              <w:pStyle w:val="Compact"/>
+            </w:pPr>
+            <w:r>
+              <w:t xml:space="preserve">Schreiben auf den Bereitstellungsbranch und Tags pushen</w:t>
             </w:r>
           </w:p>
         </w:tc>
@@ -495,7 +332,7 @@
               <w:pStyle w:val="Compact"/>
             </w:pPr>
             <w:r>
-              <w:t xml:space="preserve">Runner, Secrets, Environments, Rulesets und Vertragsschalter verwalten</w:t>
+              <w:t xml:space="preserve">Runner, Secrets, Environments und Rulesets verwalten</w:t>
             </w:r>
           </w:p>
         </w:tc>
@@ -512,33 +349,7 @@
         </w:tc>
       </w:tr>
     </w:tbl>
-    <w:p>
-      <w:pPr>
-        <w:pStyle w:val="BodyText"/>
-      </w:pPr>
-      <w:r>
-        <w:t xml:space="preserve">Ein verpflichtendes fremdes Pull-Request-Review ist im Zielbild nicht</w:t>
-      </w:r>
-      <w:r>
-        <w:t xml:space="preserve"> </w:t>
-      </w:r>
-      <w:r>
-        <w:t xml:space="preserve">vorgesehen. Direkte Pushes sind für Entwicklung und Abnahme erlaubt. Nur die</w:t>
-      </w:r>
-      <w:r>
-        <w:t xml:space="preserve"> </w:t>
-      </w:r>
-      <w:r>
-        <w:t xml:space="preserve">Bereitstellung verlangt einen Pull Request; der Ersteller darf ihn nach</w:t>
-      </w:r>
-      <w:r>
-        <w:t xml:space="preserve"> </w:t>
-      </w:r>
-      <w:r>
-        <w:t xml:space="preserve">erfolgreichen Pflichtchecks selbst mergen.</w:t>
-      </w:r>
-    </w:p>
-    <w:bookmarkEnd w:id="13"/>
+    <w:bookmarkEnd w:id="12"/>
     <w:bookmarkStart w:id="15" w:name="X4c27be40f259f44d3b13dd583c1725463a667a2"/>
     <w:p>
       <w:pPr>
@@ -657,7 +468,7 @@
               <w:rPr>
                 <w:rStyle w:val="VerbatimChar"/>
               </w:rPr>
-              <w:t xml:space="preserve">R261/Entwicklung</w:t>
+              <w:t xml:space="preserve">R271/Entwicklung</w:t>
             </w:r>
           </w:p>
         </w:tc>
@@ -698,54 +509,7 @@
               <w:rPr>
                 <w:rStyle w:val="VerbatimChar"/>
               </w:rPr>
-              <w:t xml:space="preserve">feature/R261/12345-neuer-baustein</w:t>
-            </w:r>
-          </w:p>
-        </w:tc>
-      </w:tr>
-      <w:tr>
-        <w:tc>
-          <w:tcPr/>
-          <w:p>
-            <w:pPr>
-              <w:pStyle w:val="Compact"/>
-            </w:pPr>
-            <w:r>
-              <w:t xml:space="preserve">Auswahlbranch</w:t>
-            </w:r>
-          </w:p>
-        </w:tc>
-        <w:tc>
-          <w:tcPr/>
-          <w:p>
-            <w:pPr>
-              <w:pStyle w:val="Compact"/>
-            </w:pPr>
-            <w:r>
-              <w:rPr>
-                <w:rStyle w:val="VerbatimChar"/>
-              </w:rPr>
-              <w:t xml:space="preserve">release/Rnnn-YYYYMMDDTHHMMSSZ</w:t>
-            </w:r>
-            <w:r>
-              <w:t xml:space="preserve"> </w:t>
-            </w:r>
-            <w:r>
-              <w:t xml:space="preserve">in UTC</w:t>
-            </w:r>
-          </w:p>
-        </w:tc>
-        <w:tc>
-          <w:tcPr/>
-          <w:p>
-            <w:pPr>
-              <w:pStyle w:val="Compact"/>
-            </w:pPr>
-            <w:r>
-              <w:rPr>
-                <w:rStyle w:val="VerbatimChar"/>
-              </w:rPr>
-              <w:t xml:space="preserve">release/R261-20260715T143000Z</w:t>
+              <w:t xml:space="preserve">feature/R270/12345-neuer-baustein</w:t>
             </w:r>
           </w:p>
         </w:tc>
@@ -804,78 +568,13 @@
         </w:tc>
       </w:tr>
     </w:tbl>
-    <w:p>
-      <w:pPr>
-        <w:pStyle w:val="BodyText"/>
-      </w:pPr>
-      <w:r>
-        <w:t xml:space="preserve">Feature-Branches sind eine optionale lokale Arbeits- und Namenskonvention. Sie</w:t>
-      </w:r>
-      <w:r>
-        <w:t xml:space="preserve"> </w:t>
-      </w:r>
-      <w:r>
-        <w:t xml:space="preserve">sind kein Pull-Request-Gate und lösen keine Verteilung aus. Maßgeblich für die</w:t>
-      </w:r>
-      <w:r>
-        <w:t xml:space="preserve"> </w:t>
-      </w:r>
-      <w:r>
-        <w:t xml:space="preserve">Automatisierung sind nur Pushes auf die Stufenbranches. Groß-/Kleinschreibung</w:t>
-      </w:r>
-      <w:r>
-        <w:t xml:space="preserve"> </w:t>
-      </w:r>
-      <w:r>
-        <w:t xml:space="preserve">der Stufen ist verbindlich. Aktive Linien sind derzeit</w:t>
-      </w:r>
-      <w:r>
-        <w:t xml:space="preserve"> </w:t>
-      </w:r>
-      <w:r>
-        <w:rPr>
-          <w:rStyle w:val="VerbatimChar"/>
-        </w:rPr>
-        <w:t xml:space="preserve">R260</w:t>
-      </w:r>
-      <w:r>
-        <w:t xml:space="preserve">,</w:t>
-      </w:r>
-      <w:r>
-        <w:t xml:space="preserve"> </w:t>
-      </w:r>
-      <w:r>
-        <w:rPr>
-          <w:rStyle w:val="VerbatimChar"/>
-        </w:rPr>
-        <w:t xml:space="preserve">R261</w:t>
-      </w:r>
-      <w:r>
-        <w:t xml:space="preserve"> </w:t>
-      </w:r>
-      <w:r>
-        <w:t xml:space="preserve">und</w:t>
-      </w:r>
-      <w:r>
-        <w:t xml:space="preserve"> </w:t>
-      </w:r>
-      <w:r>
-        <w:rPr>
-          <w:rStyle w:val="VerbatimChar"/>
-        </w:rPr>
-        <w:t xml:space="preserve">R270</w:t>
-      </w:r>
-      <w:r>
-        <w:t xml:space="preserve">.</w:t>
-      </w:r>
-    </w:p>
-    <w:bookmarkStart w:id="14" w:name="commit-und-sha-einfach-erklärt"/>
+    <w:bookmarkStart w:id="13" w:name="feature-branch-einfach-erklärt"/>
     <w:p>
       <w:pPr>
         <w:pStyle w:val="Heading3"/>
       </w:pPr>
       <w:r>
-        <w:t xml:space="preserve">Commit und SHA einfach erklärt</w:t>
+        <w:t xml:space="preserve">Feature-Branch einfach erklärt</w:t>
       </w:r>
     </w:p>
     <w:p>
@@ -893,19 +592,167 @@
           <w:b/>
           <w:bCs/>
         </w:rPr>
-        <w:t xml:space="preserve">Commit</w:t>
-      </w:r>
-      <w:r>
-        <w:t xml:space="preserve"> </w:t>
-      </w:r>
-      <w:r>
-        <w:t xml:space="preserve">ist ein gespeicherter Stand im Git-Repository. Jeder Commit hat</w:t>
-      </w:r>
-      <w:r>
-        <w:t xml:space="preserve"> </w:t>
-      </w:r>
-      <w:r>
-        <w:t xml:space="preserve">eine eindeutige technische Kennung, den</w:t>
+        <w:t xml:space="preserve">Feature-Branch</w:t>
+      </w:r>
+      <w:r>
+        <w:t xml:space="preserve"> </w:t>
+      </w:r>
+      <w:r>
+        <w:t xml:space="preserve">ist ein eigener Arbeitsbereich für eine einzelne</w:t>
+      </w:r>
+      <w:r>
+        <w:t xml:space="preserve"> </w:t>
+      </w:r>
+      <w:r>
+        <w:t xml:space="preserve">Änderung. Dort kann ein noch unfertiger Stand gespeichert und bei Bedarf nach</w:t>
+      </w:r>
+      <w:r>
+        <w:t xml:space="preserve"> </w:t>
+      </w:r>
+      <w:r>
+        <w:t xml:space="preserve">GitHub gepusht werden, ohne bereits das M/Text-Entwicklungssystem zu</w:t>
+      </w:r>
+      <w:r>
+        <w:t xml:space="preserve"> </w:t>
+      </w:r>
+      <w:r>
+        <w:t xml:space="preserve">aktualisieren. Das ist besonders nützlich, wenn eine Änderung mehrere Tage</w:t>
+      </w:r>
+      <w:r>
+        <w:t xml:space="preserve"> </w:t>
+      </w:r>
+      <w:r>
+        <w:t xml:space="preserve">dauert, mehrere Personen daran arbeiten oder der Zwischenstand zunächst</w:t>
+      </w:r>
+      <w:r>
+        <w:t xml:space="preserve"> </w:t>
+      </w:r>
+      <w:r>
+        <w:t xml:space="preserve">geprüft werden soll.</w:t>
+      </w:r>
+    </w:p>
+    <w:p>
+      <w:pPr>
+        <w:pStyle w:val="BodyText"/>
+      </w:pPr>
+      <w:r>
+        <w:t xml:space="preserve">Für eine kleine, fertig vorbereitete Änderung ist kein Feature-Branch nötig.</w:t>
+      </w:r>
+      <w:r>
+        <w:t xml:space="preserve"> </w:t>
+      </w:r>
+      <w:r>
+        <w:t xml:space="preserve">Sie kann direkt auf dem passenden Entwicklungsbranch bearbeitet und gepusht</w:t>
+      </w:r>
+      <w:r>
+        <w:t xml:space="preserve"> </w:t>
+      </w:r>
+      <w:r>
+        <w:t xml:space="preserve">werden. Ist die Arbeit auf einem Feature-Branch abgeschlossen, wird der</w:t>
+      </w:r>
+      <w:r>
+        <w:t xml:space="preserve"> </w:t>
+      </w:r>
+      <w:r>
+        <w:t xml:space="preserve">gewünschte Commit nach</w:t>
+      </w:r>
+      <w:r>
+        <w:t xml:space="preserve"> </w:t>
+      </w:r>
+      <w:r>
+        <w:rPr>
+          <w:rStyle w:val="VerbatimChar"/>
+        </w:rPr>
+        <w:t xml:space="preserve">&lt;Releaselinie&gt;/Entwicklung</w:t>
+      </w:r>
+      <w:r>
+        <w:t xml:space="preserve"> </w:t>
+      </w:r>
+      <w:r>
+        <w:t xml:space="preserve">übernommen. Erst der Push</w:t>
+      </w:r>
+      <w:r>
+        <w:t xml:space="preserve"> </w:t>
+      </w:r>
+      <w:r>
+        <w:t xml:space="preserve">dieses Entwicklungsbranches startet die M/Text-Synchronisation. Der</w:t>
+      </w:r>
+      <w:r>
+        <w:t xml:space="preserve"> </w:t>
+      </w:r>
+      <w:r>
+        <w:t xml:space="preserve">Feature-Branch selbst bezeichnet keine Lieferstufe und löst keine Automation</w:t>
+      </w:r>
+      <w:r>
+        <w:t xml:space="preserve"> </w:t>
+      </w:r>
+      <w:r>
+        <w:t xml:space="preserve">aus.</w:t>
+      </w:r>
+    </w:p>
+    <w:p>
+      <w:pPr>
+        <w:pStyle w:val="BodyText"/>
+      </w:pPr>
+      <w:r>
+        <w:t xml:space="preserve">Groß-/Kleinschreibung der Stufen ist verbindlich. Aktive Linien sind derzeit</w:t>
+      </w:r>
+      <w:r>
+        <w:t xml:space="preserve"> </w:t>
+      </w:r>
+      <w:r>
+        <w:rPr>
+          <w:rStyle w:val="VerbatimChar"/>
+        </w:rPr>
+        <w:t xml:space="preserve">R260</w:t>
+      </w:r>
+      <w:r>
+        <w:t xml:space="preserve">,</w:t>
+      </w:r>
+      <w:r>
+        <w:t xml:space="preserve"> </w:t>
+      </w:r>
+      <w:r>
+        <w:rPr>
+          <w:rStyle w:val="VerbatimChar"/>
+        </w:rPr>
+        <w:t xml:space="preserve">R261</w:t>
+      </w:r>
+      <w:r>
+        <w:t xml:space="preserve"> </w:t>
+      </w:r>
+      <w:r>
+        <w:t xml:space="preserve">und</w:t>
+      </w:r>
+      <w:r>
+        <w:t xml:space="preserve"> </w:t>
+      </w:r>
+      <w:r>
+        <w:rPr>
+          <w:rStyle w:val="VerbatimChar"/>
+        </w:rPr>
+        <w:t xml:space="preserve">R270</w:t>
+      </w:r>
+      <w:r>
+        <w:t xml:space="preserve">.</w:t>
+      </w:r>
+    </w:p>
+    <w:bookmarkEnd w:id="13"/>
+    <w:bookmarkStart w:id="14" w:name="commit-und-sha-einfach-erklärt"/>
+    <w:p>
+      <w:pPr>
+        <w:pStyle w:val="Heading3"/>
+      </w:pPr>
+      <w:r>
+        <w:t xml:space="preserve">Commit und SHA einfach erklärt</w:t>
+      </w:r>
+    </w:p>
+    <w:p>
+      <w:pPr>
+        <w:pStyle w:val="FirstParagraph"/>
+      </w:pPr>
+      <w:r>
+        <w:t xml:space="preserve">Ein</w:t>
       </w:r>
       <w:r>
         <w:t xml:space="preserve"> </w:t>
@@ -915,6 +762,28 @@
           <w:b/>
           <w:bCs/>
         </w:rPr>
+        <w:t xml:space="preserve">Commit</w:t>
+      </w:r>
+      <w:r>
+        <w:t xml:space="preserve"> </w:t>
+      </w:r>
+      <w:r>
+        <w:t xml:space="preserve">ist ein gespeicherter Stand im Git-Repository. Jeder Commit hat</w:t>
+      </w:r>
+      <w:r>
+        <w:t xml:space="preserve"> </w:t>
+      </w:r>
+      <w:r>
+        <w:t xml:space="preserve">eine eindeutige technische Kennung, den</w:t>
+      </w:r>
+      <w:r>
+        <w:t xml:space="preserve"> </w:t>
+      </w:r>
+      <w:r>
+        <w:rPr>
+          <w:b/>
+          <w:bCs/>
+        </w:rPr>
         <w:t xml:space="preserve">Commit-SHA</w:t>
       </w:r>
       <w:r>
@@ -1063,6 +932,68 @@
       </w:pPr>
       <w:r>
         <w:t xml:space="preserve">Daneben kommen zwei ähnlich aussehende, aber anders verwendete Kennungen vor:</w:t>
+      </w:r>
+    </w:p>
+    <w:p>
+      <w:pPr>
+        <w:pStyle w:val="Compact"/>
+        <w:numPr>
+          <w:ilvl w:val="0"/>
+          <w:numId w:val="1001"/>
+        </w:numPr>
+      </w:pPr>
+      <w:r>
+        <w:t xml:space="preserve">Der Commit-SHA von</w:t>
+      </w:r>
+      <w:r>
+        <w:t xml:space="preserve"> </w:t>
+      </w:r>
+      <w:r>
+        <w:rPr>
+          <w:rStyle w:val="VerbatimChar"/>
+        </w:rPr>
+        <w:t xml:space="preserve">mtext-actions</w:t>
+      </w:r>
+      <w:r>
+        <w:t xml:space="preserve"> </w:t>
+      </w:r>
+      <w:r>
+        <w:t xml:space="preserve">legt für Administratoren fest, welche</w:t>
+      </w:r>
+      <w:r>
+        <w:t xml:space="preserve"> </w:t>
+      </w:r>
+      <w:r>
+        <w:t xml:space="preserve">freigegebene Version der zentralen Automation verwendet wird.</w:t>
+      </w:r>
+    </w:p>
+    <w:p>
+      <w:pPr>
+        <w:pStyle w:val="Compact"/>
+        <w:numPr>
+          <w:ilvl w:val="0"/>
+          <w:numId w:val="1001"/>
+        </w:numPr>
+      </w:pPr>
+      <w:r>
+        <w:t xml:space="preserve">Eine SHA-256-Prüfsumme bestätigt, dass eine erzeugte Paketdatei nach dem Bau</w:t>
+      </w:r>
+      <w:r>
+        <w:t xml:space="preserve"> </w:t>
+      </w:r>
+      <w:r>
+        <w:t xml:space="preserve">nicht verändert wurde. Sie bezeichnet keinen Git-Commit.</w:t>
+      </w:r>
+    </w:p>
+    <w:bookmarkEnd w:id="14"/>
+    <w:bookmarkEnd w:id="15"/>
+    <w:bookmarkStart w:id="16" w:name="X18377f702a880a3fc4dfa7ec32774d477fd12ff"/>
+    <w:p>
+      <w:pPr>
+        <w:pStyle w:val="Heading2"/>
+      </w:pPr>
+      <w:r>
+        <w:t xml:space="preserve">4. Änderung nach Entwicklung bringen</w:t>
       </w:r>
     </w:p>
     <w:p>
@@ -1074,7 +1005,7 @@
         </w:numPr>
       </w:pPr>
       <w:r>
-        <w:t xml:space="preserve">Der Commit-SHA von</w:t>
+        <w:t xml:space="preserve">Den aktuellen</w:t>
       </w:r>
       <w:r>
         <w:t xml:space="preserve"> </w:t>
@@ -1083,19 +1014,37 @@
         <w:rPr>
           <w:rStyle w:val="VerbatimChar"/>
         </w:rPr>
-        <w:t xml:space="preserve">mtext-actions</w:t>
-      </w:r>
-      <w:r>
-        <w:t xml:space="preserve"> </w:t>
-      </w:r>
-      <w:r>
-        <w:t xml:space="preserve">legt für Administratoren fest, welche</w:t>
-      </w:r>
-      <w:r>
-        <w:t xml:space="preserve"> </w:t>
-      </w:r>
-      <w:r>
-        <w:t xml:space="preserve">freigegebene Version der zentralen Automation verwendet wird.</w:t>
+        <w:t xml:space="preserve">&lt;Releaselinie&gt;/Entwicklung</w:t>
+      </w:r>
+      <w:r>
+        <w:t xml:space="preserve"> </w:t>
+      </w:r>
+      <w:r>
+        <w:t xml:space="preserve">auschecken; für länger laufende,</w:t>
+      </w:r>
+      <w:r>
+        <w:t xml:space="preserve"> </w:t>
+      </w:r>
+      <w:r>
+        <w:t xml:space="preserve">gemeinsam bearbeitete oder zunächst zu prüfende Änderungen optional einen</w:t>
+      </w:r>
+      <w:r>
+        <w:t xml:space="preserve"> </w:t>
+      </w:r>
+      <w:r>
+        <w:t xml:space="preserve">Feature-Branch erstellen, zum Beispiel</w:t>
+      </w:r>
+      <w:r>
+        <w:t xml:space="preserve"> </w:t>
+      </w:r>
+      <w:r>
+        <w:rPr>
+          <w:rStyle w:val="VerbatimChar"/>
+        </w:rPr>
+        <w:t xml:space="preserve">feature/R270/12345-BT0002-Anpassungen-am-Text</w:t>
+      </w:r>
+      <w:r>
+        <w:t xml:space="preserve">.</w:t>
       </w:r>
     </w:p>
     <w:p>
@@ -1107,24 +1056,122 @@
         </w:numPr>
       </w:pPr>
       <w:r>
-        <w:t xml:space="preserve">Eine SHA-256-Prüfsumme bestätigt, dass eine erzeugte Paketdatei nach dem Bau</w:t>
-      </w:r>
-      <w:r>
-        <w:t xml:space="preserve"> </w:t>
-      </w:r>
-      <w:r>
-        <w:t xml:space="preserve">nicht verändert wurde. Sie bezeichnet keinen Git-Commit.</w:t>
-      </w:r>
-    </w:p>
-    <w:bookmarkEnd w:id="14"/>
-    <w:bookmarkEnd w:id="15"/>
-    <w:bookmarkStart w:id="16" w:name="X18377f702a880a3fc4dfa7ec32774d477fd12ff"/>
+        <w:t xml:space="preserve">Fachlich vorgesehene Änderungen an den Brief-Ressourcen durchführen.</w:t>
+      </w:r>
+    </w:p>
+    <w:p>
+      <w:pPr>
+        <w:pStyle w:val="Compact"/>
+        <w:numPr>
+          <w:ilvl w:val="0"/>
+          <w:numId w:val="1002"/>
+        </w:numPr>
+      </w:pPr>
+      <w:r>
+        <w:t xml:space="preserve">Änderungen committen.</w:t>
+      </w:r>
+    </w:p>
+    <w:p>
+      <w:pPr>
+        <w:pStyle w:val="Compact"/>
+        <w:numPr>
+          <w:ilvl w:val="0"/>
+          <w:numId w:val="1002"/>
+        </w:numPr>
+      </w:pPr>
+      <w:r>
+        <w:t xml:space="preserve">Den Commit direkt nach</w:t>
+      </w:r>
+      <w:r>
+        <w:t xml:space="preserve"> </w:t>
+      </w:r>
+      <w:r>
+        <w:rPr>
+          <w:rStyle w:val="VerbatimChar"/>
+        </w:rPr>
+        <w:t xml:space="preserve">&lt;Releaselinie&gt;/Entwicklung</w:t>
+      </w:r>
+      <w:r>
+        <w:t xml:space="preserve"> </w:t>
+      </w:r>
+      <w:r>
+        <w:t xml:space="preserve">pushen.</w:t>
+      </w:r>
+    </w:p>
+    <w:p>
+      <w:pPr>
+        <w:pStyle w:val="Compact"/>
+        <w:numPr>
+          <w:ilvl w:val="0"/>
+          <w:numId w:val="1002"/>
+        </w:numPr>
+      </w:pPr>
+      <w:r>
+        <w:t xml:space="preserve">Im GitHub unter</w:t>
+      </w:r>
+      <w:r>
+        <w:t xml:space="preserve"> </w:t>
+      </w:r>
+      <w:r>
+        <w:rPr>
+          <w:b/>
+          <w:bCs/>
+        </w:rPr>
+        <w:t xml:space="preserve">Actions → Sync M/Text resources</w:t>
+      </w:r>
+      <w:r>
+        <w:t xml:space="preserve"> </w:t>
+      </w:r>
+      <w:r>
+        <w:t xml:space="preserve">den durch den Push</w:t>
+      </w:r>
+      <w:r>
+        <w:t xml:space="preserve"> </w:t>
+      </w:r>
+      <w:r>
+        <w:t xml:space="preserve">ausgelösten Lauf kontrollieren.</w:t>
+      </w:r>
+    </w:p>
+    <w:p>
+      <w:pPr>
+        <w:pStyle w:val="FirstParagraph"/>
+      </w:pPr>
+      <w:r>
+        <w:t xml:space="preserve">Der Push startet die Synchronisation des exakten Commits. Ein erfolgreicher</w:t>
+      </w:r>
+      <w:r>
+        <w:t xml:space="preserve"> </w:t>
+      </w:r>
+      <w:r>
+        <w:t xml:space="preserve">Lauf endet mit</w:t>
+      </w:r>
+      <w:r>
+        <w:t xml:space="preserve"> </w:t>
+      </w:r>
+      <w:r>
+        <w:rPr>
+          <w:rStyle w:val="VerbatimChar"/>
+        </w:rPr>
+        <w:t xml:space="preserve">ADAPTER_ACCEPTED</w:t>
+      </w:r>
+      <w:r>
+        <w:t xml:space="preserve">; dies bestätigt die synchrone 2xx-Annahme des</w:t>
+      </w:r>
+      <w:r>
+        <w:t xml:space="preserve"> </w:t>
+      </w:r>
+      <w:r>
+        <w:t xml:space="preserve">Adapters, nicht einen späteren fachlichen M/Text-Jobstatus.</w:t>
+      </w:r>
+    </w:p>
+    <w:bookmarkEnd w:id="16"/>
+    <w:bookmarkStart w:id="17" w:name="Xa12cbb55742e8c0700c3211008f335844c3c147"/>
     <w:p>
       <w:pPr>
         <w:pStyle w:val="Heading2"/>
       </w:pPr>
       <w:r>
-        <w:t xml:space="preserve">4. Änderung nach Entwicklung bringen</w:t>
+        <w:t xml:space="preserve">5. Nach Abnahme promoten</w:t>
       </w:r>
     </w:p>
     <w:p>
@@ -1136,7 +1183,7 @@
         </w:numPr>
       </w:pPr>
       <w:r>
-        <w:t xml:space="preserve">Das richtige Mandanten-Repository und die betroffene Releaselinie wählen.</w:t>
+        <w:t xml:space="preserve">Den in Entwicklung erfolgreich geprüften Commit ermitteln.</w:t>
       </w:r>
     </w:p>
     <w:p>
@@ -1148,7 +1195,7 @@
         </w:numPr>
       </w:pPr>
       <w:r>
-        <w:t xml:space="preserve">Den aktuellen</w:t>
+        <w:t xml:space="preserve">Genau diesen Commit direkt nach</w:t>
       </w:r>
       <w:r>
         <w:t xml:space="preserve"> </w:t>
@@ -1157,19 +1204,13 @@
         <w:rPr>
           <w:rStyle w:val="VerbatimChar"/>
         </w:rPr>
-        <w:t xml:space="preserve">&lt;Releaselinie&gt;/Entwicklung</w:t>
-      </w:r>
-      <w:r>
-        <w:t xml:space="preserve"> </w:t>
-      </w:r>
-      <w:r>
-        <w:t xml:space="preserve">auschecken; optional dafür einen</w:t>
-      </w:r>
-      <w:r>
-        <w:t xml:space="preserve"> </w:t>
-      </w:r>
-      <w:r>
-        <w:t xml:space="preserve">lokalen Feature-Branch erstellen.</w:t>
+        <w:t xml:space="preserve">&lt;Releaselinie&gt;/Abnahme</w:t>
+      </w:r>
+      <w:r>
+        <w:t xml:space="preserve"> </w:t>
+      </w:r>
+      <w:r>
+        <w:t xml:space="preserve">pushen.</w:t>
       </w:r>
     </w:p>
     <w:p>
@@ -1181,13 +1222,23 @@
         </w:numPr>
       </w:pPr>
       <w:r>
-        <w:t xml:space="preserve">Nur die fachlich vorgesehenen Ressourcen ändern. Die Mandantenkonfiguration</w:t>
-      </w:r>
-      <w:r>
-        <w:t xml:space="preserve"> </w:t>
-      </w:r>
-      <w:r>
-        <w:t xml:space="preserve">nur gemeinsam mit der fachlichen Zuordnung ändern; keine Secrets ablegen.</w:t>
+        <w:t xml:space="preserve">Unter</w:t>
+      </w:r>
+      <w:r>
+        <w:t xml:space="preserve"> </w:t>
+      </w:r>
+      <w:r>
+        <w:rPr>
+          <w:b/>
+          <w:bCs/>
+        </w:rPr>
+        <w:t xml:space="preserve">Actions → Sync M/Text resources</w:t>
+      </w:r>
+      <w:r>
+        <w:t xml:space="preserve"> </w:t>
+      </w:r>
+      <w:r>
+        <w:t xml:space="preserve">den Abnahmelauf kontrollieren.</w:t>
       </w:r>
     </w:p>
     <w:p>
@@ -1199,56 +1250,13 @@
         </w:numPr>
       </w:pPr>
       <w:r>
-        <w:t xml:space="preserve">Änderungen committen und den gewünschten Commit direkt nach</w:t>
-      </w:r>
-      <w:r>
-        <w:t xml:space="preserve"> </w:t>
-      </w:r>
-      <w:r>
-        <w:rPr>
-          <w:rStyle w:val="VerbatimChar"/>
-        </w:rPr>
-        <w:t xml:space="preserve">&lt;Releaselinie&gt;/Entwicklung</w:t>
-      </w:r>
-      <w:r>
-        <w:t xml:space="preserve"> </w:t>
-      </w:r>
-      <w:r>
-        <w:t xml:space="preserve">pushen.</w:t>
-      </w:r>
-    </w:p>
-    <w:p>
-      <w:pPr>
-        <w:pStyle w:val="Compact"/>
-        <w:numPr>
-          <w:ilvl w:val="0"/>
-          <w:numId w:val="1003"/>
-        </w:numPr>
-      </w:pPr>
-      <w:r>
-        <w:t xml:space="preserve">Unter</w:t>
-      </w:r>
-      <w:r>
-        <w:t xml:space="preserve"> </w:t>
-      </w:r>
-      <w:r>
-        <w:rPr>
-          <w:b/>
-          <w:bCs/>
-        </w:rPr>
-        <w:t xml:space="preserve">Actions → Sync M/Text resources</w:t>
-      </w:r>
-      <w:r>
-        <w:t xml:space="preserve"> </w:t>
-      </w:r>
-      <w:r>
-        <w:t xml:space="preserve">den durch den Push ausgelösten</w:t>
-      </w:r>
-      <w:r>
-        <w:t xml:space="preserve"> </w:t>
-      </w:r>
-      <w:r>
-        <w:t xml:space="preserve">Lauf kontrollieren.</w:t>
+        <w:t xml:space="preserve">Die fachliche Abnahme außerhalb des Workflows nach dem vereinbarten</w:t>
+      </w:r>
+      <w:r>
+        <w:t xml:space="preserve"> </w:t>
+      </w:r>
+      <w:r>
+        <w:t xml:space="preserve">Verfahren dokumentieren.</w:t>
       </w:r>
     </w:p>
     <w:p>
@@ -1256,41 +1264,41 @@
         <w:pStyle w:val="FirstParagraph"/>
       </w:pPr>
       <w:r>
-        <w:t xml:space="preserve">Der Push startet die Synchronisation des exakten Commits. Ein erfolgreicher</w:t>
-      </w:r>
-      <w:r>
-        <w:t xml:space="preserve"> </w:t>
-      </w:r>
-      <w:r>
-        <w:t xml:space="preserve">Lauf endet mit</w:t>
-      </w:r>
-      <w:r>
-        <w:t xml:space="preserve"> </w:t>
-      </w:r>
-      <w:r>
-        <w:rPr>
-          <w:rStyle w:val="VerbatimChar"/>
-        </w:rPr>
-        <w:t xml:space="preserve">ADAPTER_ACCEPTED</w:t>
-      </w:r>
-      <w:r>
-        <w:t xml:space="preserve">; dies bestätigt die synchrone 2xx-Annahme des</w:t>
-      </w:r>
-      <w:r>
-        <w:t xml:space="preserve"> </w:t>
-      </w:r>
-      <w:r>
-        <w:t xml:space="preserve">Adapters, nicht einen späteren fachlichen M/Text-Jobstatus.</w:t>
-      </w:r>
-    </w:p>
-    <w:bookmarkEnd w:id="16"/>
-    <w:bookmarkStart w:id="17" w:name="Xa12cbb55742e8c0700c3211008f335844c3c147"/>
+        <w:t xml:space="preserve">Der Push nach Abnahme verteilt den vollständigen konfigurierten Projektstand</w:t>
+      </w:r>
+      <w:r>
+        <w:t xml:space="preserve"> </w:t>
+      </w:r>
+      <w:r>
+        <w:t xml:space="preserve">des vom Anwender fachlich freigegebenen Commits. Er baut noch kein</w:t>
+      </w:r>
+      <w:r>
+        <w:t xml:space="preserve"> </w:t>
+      </w:r>
+      <w:r>
+        <w:t xml:space="preserve">Mainframe-Paket. Die Auswahl dieses Commits ist eine fachliche</w:t>
+      </w:r>
+      <w:r>
+        <w:t xml:space="preserve"> </w:t>
+      </w:r>
+      <w:r>
+        <w:t xml:space="preserve">Verantwortlichkeit; der Workflow erzwingt keine Gleichheit mit einem früheren</w:t>
+      </w:r>
+      <w:r>
+        <w:t xml:space="preserve"> </w:t>
+      </w:r>
+      <w:r>
+        <w:t xml:space="preserve">Entwicklungspush.</w:t>
+      </w:r>
+    </w:p>
+    <w:bookmarkEnd w:id="17"/>
+    <w:bookmarkStart w:id="18" w:name="X1d29f67292db16d3b934776c489b37252db8844"/>
     <w:p>
       <w:pPr>
         <w:pStyle w:val="Heading2"/>
       </w:pPr>
       <w:r>
-        <w:t xml:space="preserve">5. Nach Abnahme promoten</w:t>
+        <w:t xml:space="preserve">6. Ausgewählte Änderungen bereitstellen</w:t>
       </w:r>
     </w:p>
     <w:p>
@@ -1302,7 +1310,22 @@
         </w:numPr>
       </w:pPr>
       <w:r>
-        <w:t xml:space="preserve">Den in Entwicklung erfolgreich geprüften Commit ermitteln.</w:t>
+        <w:t xml:space="preserve">Den aktuellen</w:t>
+      </w:r>
+      <w:r>
+        <w:t xml:space="preserve"> </w:t>
+      </w:r>
+      <w:r>
+        <w:rPr>
+          <w:rStyle w:val="VerbatimChar"/>
+        </w:rPr>
+        <w:t xml:space="preserve">&lt;Releaselinie&gt;/Bereitstellung</w:t>
+      </w:r>
+      <w:r>
+        <w:t xml:space="preserve"> </w:t>
+      </w:r>
+      <w:r>
+        <w:t xml:space="preserve">auschecken.</w:t>
       </w:r>
     </w:p>
     <w:p>
@@ -1314,7 +1337,7 @@
         </w:numPr>
       </w:pPr>
       <w:r>
-        <w:t xml:space="preserve">Genau diesen Commit direkt nach</w:t>
+        <w:t xml:space="preserve">Ausschließlich die fachlich freigegebenen Commits aus Abnahme per</w:t>
       </w:r>
       <w:r>
         <w:t xml:space="preserve"> </w:t>
@@ -1323,13 +1346,19 @@
         <w:rPr>
           <w:rStyle w:val="VerbatimChar"/>
         </w:rPr>
-        <w:t xml:space="preserve">&lt;Releaselinie&gt;/Abnahme</w:t>
-      </w:r>
-      <w:r>
-        <w:t xml:space="preserve"> </w:t>
-      </w:r>
-      <w:r>
-        <w:t xml:space="preserve">pushen.</w:t>
+        <w:t xml:space="preserve">git cherry-pick</w:t>
+      </w:r>
+      <w:r>
+        <w:t xml:space="preserve"> </w:t>
+      </w:r>
+      <w:r>
+        <w:t xml:space="preserve">übernehmen. Konflikte fachlich prüfen; keine ungeprüften</w:t>
+      </w:r>
+      <w:r>
+        <w:t xml:space="preserve"> </w:t>
+      </w:r>
+      <w:r>
+        <w:t xml:space="preserve">Konfliktauflösungen übernehmen.</w:t>
       </w:r>
     </w:p>
     <w:p>
@@ -1341,23 +1370,22 @@
         </w:numPr>
       </w:pPr>
       <w:r>
-        <w:t xml:space="preserve">Unter</w:t>
-      </w:r>
-      <w:r>
-        <w:t xml:space="preserve"> </w:t>
-      </w:r>
-      <w:r>
-        <w:rPr>
-          <w:b/>
-          <w:bCs/>
-        </w:rPr>
-        <w:t xml:space="preserve">Actions → Sync M/Text resources</w:t>
-      </w:r>
-      <w:r>
-        <w:t xml:space="preserve"> </w:t>
-      </w:r>
-      <w:r>
-        <w:t xml:space="preserve">den Abnahmelauf kontrollieren.</w:t>
+        <w:t xml:space="preserve">Den zusammengestellten Stand direkt nach</w:t>
+      </w:r>
+      <w:r>
+        <w:t xml:space="preserve"> </w:t>
+      </w:r>
+      <w:r>
+        <w:rPr>
+          <w:rStyle w:val="VerbatimChar"/>
+        </w:rPr>
+        <w:t xml:space="preserve">&lt;Releaselinie&gt;/Bereitstellung</w:t>
+      </w:r>
+      <w:r>
+        <w:t xml:space="preserve"> </w:t>
+      </w:r>
+      <w:r>
+        <w:t xml:space="preserve">pushen.</w:t>
       </w:r>
     </w:p>
     <w:p>
@@ -1369,13 +1397,13 @@
         </w:numPr>
       </w:pPr>
       <w:r>
-        <w:t xml:space="preserve">Die fachliche Abnahme außerhalb des Workflows nach dem vereinbarten</w:t>
-      </w:r>
-      <w:r>
-        <w:t xml:space="preserve"> </w:t>
-      </w:r>
-      <w:r>
-        <w:t xml:space="preserve">Verfahren dokumentieren.</w:t>
+        <w:t xml:space="preserve">Den Ziel-Commit notieren. Der Push startet weder Paketbau noch</w:t>
+      </w:r>
+      <w:r>
+        <w:t xml:space="preserve"> </w:t>
+      </w:r>
+      <w:r>
+        <w:t xml:space="preserve">Mainframe-Übergabe.</w:t>
       </w:r>
     </w:p>
     <w:p>
@@ -1383,41 +1411,52 @@
         <w:pStyle w:val="FirstParagraph"/>
       </w:pPr>
       <w:r>
-        <w:t xml:space="preserve">Der Push nach Abnahme verteilt den vollständigen konfigurierten Projektstand</w:t>
-      </w:r>
-      <w:r>
-        <w:t xml:space="preserve"> </w:t>
-      </w:r>
-      <w:r>
-        <w:t xml:space="preserve">des vom Anwender fachlich freigegebenen Commits. Er baut noch kein</w:t>
-      </w:r>
-      <w:r>
-        <w:t xml:space="preserve"> </w:t>
-      </w:r>
-      <w:r>
-        <w:t xml:space="preserve">Mainframe-Paket. Die Auswahl dieses Commits ist eine fachliche</w:t>
-      </w:r>
-      <w:r>
-        <w:t xml:space="preserve"> </w:t>
-      </w:r>
-      <w:r>
-        <w:t xml:space="preserve">Verantwortlichkeit; der Workflow erzwingt keine Gleichheit mit einem früheren</w:t>
-      </w:r>
-      <w:r>
-        <w:t xml:space="preserve"> </w:t>
-      </w:r>
-      <w:r>
-        <w:t xml:space="preserve">Entwicklungspush.</w:t>
-      </w:r>
-    </w:p>
-    <w:bookmarkEnd w:id="17"/>
-    <w:bookmarkStart w:id="18" w:name="X1d29f67292db16d3b934776c489b37252db8844"/>
+        <w:t xml:space="preserve">Die Auswahl der Commits ist eine fachliche Verantwortung. Die verbindliche</w:t>
+      </w:r>
+      <w:r>
+        <w:t xml:space="preserve"> </w:t>
+      </w:r>
+      <w:r>
+        <w:t xml:space="preserve">technische Prüfung erfolgt erst, wenn der Release-Tag gesetzt wird.</w:t>
+      </w:r>
+    </w:p>
+    <w:bookmarkEnd w:id="18"/>
+    <w:bookmarkStart w:id="19" w:name="X08ed1942a851ecf1b66055bac4c3dbac74b6050"/>
     <w:p>
       <w:pPr>
         <w:pStyle w:val="Heading2"/>
       </w:pPr>
       <w:r>
-        <w:t xml:space="preserve">6. Ausgewählte Änderungen bereitstellen</w:t>
+        <w:t xml:space="preserve">7. FULL oder DELTA auslösen</w:t>
+      </w:r>
+    </w:p>
+    <w:p>
+      <w:pPr>
+        <w:pStyle w:val="FirstParagraph"/>
+      </w:pPr>
+      <w:r>
+        <w:t xml:space="preserve">Vor dem Taggen müssen Releaselinie, Mandant, gewünschter Lieferungstyp und der</w:t>
+      </w:r>
+      <w:r>
+        <w:t xml:space="preserve"> </w:t>
+      </w:r>
+      <w:r>
+        <w:t xml:space="preserve">exakte Commit auf</w:t>
+      </w:r>
+      <w:r>
+        <w:t xml:space="preserve"> </w:t>
+      </w:r>
+      <w:r>
+        <w:rPr>
+          <w:rStyle w:val="VerbatimChar"/>
+        </w:rPr>
+        <w:t xml:space="preserve">&lt;Releaselinie&gt;/Bereitstellung</w:t>
+      </w:r>
+      <w:r>
+        <w:t xml:space="preserve"> </w:t>
+      </w:r>
+      <w:r>
+        <w:t xml:space="preserve">fachlich bestätigt sein.</w:t>
       </w:r>
     </w:p>
     <w:p>
@@ -1429,37 +1468,22 @@
         </w:numPr>
       </w:pPr>
       <w:r>
-        <w:t xml:space="preserve">Einen UTC-Zeitstempel bestimmen und den Auswahlbranch</w:t>
-      </w:r>
-      <w:r>
-        <w:t xml:space="preserve"> </w:t>
-      </w:r>
-      <w:r>
         <w:rPr>
           <w:rStyle w:val="VerbatimChar"/>
         </w:rPr>
-        <w:t xml:space="preserve">release/&lt;Releaselinie&gt;-&lt;YYYYMMDDTHHMMSSZ&gt;</w:t>
-      </w:r>
-      <w:r>
-        <w:t xml:space="preserve"> </w:t>
-      </w:r>
-      <w:r>
-        <w:t xml:space="preserve">vom aktuellen</w:t>
-      </w:r>
-      <w:r>
-        <w:t xml:space="preserve"> </w:t>
-      </w:r>
-      <w:r>
-        <w:rPr>
-          <w:rStyle w:val="VerbatimChar"/>
-        </w:rPr>
-        <w:t xml:space="preserve">&lt;Releaselinie&gt;/Bereitstellung</w:t>
-      </w:r>
-      <w:r>
-        <w:t xml:space="preserve"> </w:t>
-      </w:r>
-      <w:r>
-        <w:t xml:space="preserve">erstellen.</w:t>
+        <w:t xml:space="preserve">Rnnn.100</w:t>
+      </w:r>
+      <w:r>
+        <w:t xml:space="preserve"> </w:t>
+      </w:r>
+      <w:r>
+        <w:t xml:space="preserve">erzeugt ein FULL mit dem vollständigen Stand jedes Projekts der</w:t>
+      </w:r>
+      <w:r>
+        <w:t xml:space="preserve"> </w:t>
+      </w:r>
+      <w:r>
+        <w:t xml:space="preserve">Delivery-Allowlist.</w:t>
       </w:r>
     </w:p>
     <w:p>
@@ -1471,7 +1495,7 @@
         </w:numPr>
       </w:pPr>
       <w:r>
-        <w:t xml:space="preserve">Ausschließlich die fachlich freigegebenen Commits aus Abnahme per</w:t>
+        <w:t xml:space="preserve">Jede andere gültige dreistellige Endung, zum Beispiel</w:t>
       </w:r>
       <w:r>
         <w:t xml:space="preserve"> </w:t>
@@ -1480,19 +1504,31 @@
         <w:rPr>
           <w:rStyle w:val="VerbatimChar"/>
         </w:rPr>
-        <w:t xml:space="preserve">git cherry-pick</w:t>
-      </w:r>
-      <w:r>
-        <w:t xml:space="preserve"> </w:t>
-      </w:r>
-      <w:r>
-        <w:t xml:space="preserve">in diesen Branch übernehmen. Konflikte fachlich prüfen;</w:t>
-      </w:r>
-      <w:r>
-        <w:t xml:space="preserve"> </w:t>
-      </w:r>
-      <w:r>
-        <w:t xml:space="preserve">keine ungeprüften Konfliktauflösungen übernehmen.</w:t>
+        <w:t xml:space="preserve">R261.108</w:t>
+      </w:r>
+      <w:r>
+        <w:t xml:space="preserve">, erzeugt</w:t>
+      </w:r>
+      <w:r>
+        <w:t xml:space="preserve"> </w:t>
+      </w:r>
+      <w:r>
+        <w:t xml:space="preserve">ein kumulatives DELTA von</w:t>
+      </w:r>
+      <w:r>
+        <w:t xml:space="preserve"> </w:t>
+      </w:r>
+      <w:r>
+        <w:rPr>
+          <w:rStyle w:val="VerbatimChar"/>
+        </w:rPr>
+        <w:t xml:space="preserve">R261.100</w:t>
+      </w:r>
+      <w:r>
+        <w:t xml:space="preserve"> </w:t>
+      </w:r>
+      <w:r>
+        <w:t xml:space="preserve">bis zum Zieltag.</w:t>
       </w:r>
     </w:p>
     <w:p>
@@ -1504,7 +1540,7 @@
         </w:numPr>
       </w:pPr>
       <w:r>
-        <w:t xml:space="preserve">Einen Pull Request vom Auswahlbranch nach</w:t>
+        <w:t xml:space="preserve">Ein DELTA setzt voraus, dass der</w:t>
       </w:r>
       <w:r>
         <w:t xml:space="preserve"> </w:t>
@@ -1513,58 +1549,16 @@
         <w:rPr>
           <w:rStyle w:val="VerbatimChar"/>
         </w:rPr>
-        <w:t xml:space="preserve">&lt;Releaselinie&gt;/Bereitstellung</w:t>
-      </w:r>
-      <w:r>
-        <w:t xml:space="preserve"> </w:t>
-      </w:r>
-      <w:r>
-        <w:t xml:space="preserve">öffnen.</w:t>
-      </w:r>
-    </w:p>
-    <w:p>
-      <w:pPr>
-        <w:pStyle w:val="Compact"/>
-        <w:numPr>
-          <w:ilvl w:val="0"/>
-          <w:numId w:val="1005"/>
-        </w:numPr>
-      </w:pPr>
-      <w:r>
-        <w:t xml:space="preserve">Inhalt, Zielbranch und den Check</w:t>
-      </w:r>
-      <w:r>
-        <w:t xml:space="preserve"> </w:t>
-      </w:r>
-      <w:r>
-        <w:rPr>
-          <w:rStyle w:val="VerbatimChar"/>
-        </w:rPr>
-        <w:t xml:space="preserve">Validate change / Validate release promotion</w:t>
-      </w:r>
-      <w:r>
-        <w:t xml:space="preserve"> </w:t>
-      </w:r>
-      <w:r>
-        <w:t xml:space="preserve">prüfen und den Pull Request mergen.</w:t>
-      </w:r>
-    </w:p>
-    <w:p>
-      <w:pPr>
-        <w:pStyle w:val="Compact"/>
-        <w:numPr>
-          <w:ilvl w:val="0"/>
-          <w:numId w:val="1005"/>
-        </w:numPr>
-      </w:pPr>
-      <w:r>
-        <w:t xml:space="preserve">Den erzeugten Merge-Commit notieren. Der Merge allein startet weder</w:t>
-      </w:r>
-      <w:r>
-        <w:t xml:space="preserve"> </w:t>
-      </w:r>
-      <w:r>
-        <w:t xml:space="preserve">Paketbau noch Mainframe-Übergabe.</w:t>
+        <w:t xml:space="preserve">.100</w:t>
+      </w:r>
+      <w:r>
+        <w:t xml:space="preserve">-Tag derselben Linie vorhanden und</w:t>
+      </w:r>
+      <w:r>
+        <w:t xml:space="preserve"> </w:t>
+      </w:r>
+      <w:r>
+        <w:t xml:space="preserve">erreichbar ist.</w:t>
       </w:r>
     </w:p>
     <w:p>
@@ -1572,29 +1566,84 @@
         <w:pStyle w:val="FirstParagraph"/>
       </w:pPr>
       <w:r>
-        <w:t xml:space="preserve">Der Auswahlbranch muss exakt dem Namensformat entsprechen. Ein direkter Pull</w:t>
-      </w:r>
-      <w:r>
-        <w:t xml:space="preserve"> </w:t>
-      </w:r>
-      <w:r>
-        <w:t xml:space="preserve">Request von Abnahme nach Bereitstellung wird von der Promotionsvalidierung</w:t>
-      </w:r>
-      <w:r>
-        <w:t xml:space="preserve"> </w:t>
-      </w:r>
-      <w:r>
-        <w:t xml:space="preserve">abgelehnt.</w:t>
-      </w:r>
-    </w:p>
-    <w:bookmarkEnd w:id="18"/>
-    <w:bookmarkStart w:id="19" w:name="X08ed1942a851ecf1b66055bac4c3dbac74b6050"/>
-    <w:p>
-      <w:pPr>
-        <w:pStyle w:val="Heading2"/>
-      </w:pPr>
-      <w:r>
-        <w:t xml:space="preserve">7. FULL oder DELTA auslösen</w:t>
+        <w:t xml:space="preserve">Zum Auslösen einen einfachen Git-Tag auf dem bestätigten Bereitstellungscommit</w:t>
+      </w:r>
+      <w:r>
+        <w:t xml:space="preserve"> </w:t>
+      </w:r>
+      <w:r>
+        <w:t xml:space="preserve">setzen und pushen, zum Beispiel:</w:t>
+      </w:r>
+    </w:p>
+    <w:p>
+      <w:pPr>
+        <w:pStyle w:val="SourceCode"/>
+      </w:pPr>
+      <w:r>
+        <w:rPr>
+          <w:rStyle w:val="FunctionTok"/>
+        </w:rPr>
+        <w:t xml:space="preserve">git</w:t>
+      </w:r>
+      <w:r>
+        <w:rPr>
+          <w:rStyle w:val="NormalTok"/>
+        </w:rPr>
+        <w:t xml:space="preserve"> fetch origin R261/Bereitstellung </w:t>
+      </w:r>
+      <w:r>
+        <w:rPr>
+          <w:rStyle w:val="AttributeTok"/>
+        </w:rPr>
+        <w:t xml:space="preserve">--tags</w:t>
+      </w:r>
+      <w:r>
+        <w:br/>
+      </w:r>
+      <w:r>
+        <w:rPr>
+          <w:rStyle w:val="FunctionTok"/>
+        </w:rPr>
+        <w:t xml:space="preserve">git</w:t>
+      </w:r>
+      <w:r>
+        <w:rPr>
+          <w:rStyle w:val="NormalTok"/>
+        </w:rPr>
+        <w:t xml:space="preserve"> tag R261.108 </w:t>
+      </w:r>
+      <w:r>
+        <w:rPr>
+          <w:rStyle w:val="OperatorTok"/>
+        </w:rPr>
+        <w:t xml:space="preserve">&lt;</w:t>
+      </w:r>
+      <w:r>
+        <w:rPr>
+          <w:rStyle w:val="NormalTok"/>
+        </w:rPr>
+        <w:t xml:space="preserve">vollständiger-commit-sha</w:t>
+      </w:r>
+      <w:r>
+        <w:rPr>
+          <w:rStyle w:val="OperatorTok"/>
+        </w:rPr>
+        <w:t xml:space="preserve">&gt;</w:t>
+      </w:r>
+      <w:r>
+        <w:br/>
+      </w:r>
+      <w:r>
+        <w:rPr>
+          <w:rStyle w:val="FunctionTok"/>
+        </w:rPr>
+        <w:t xml:space="preserve">git</w:t>
+      </w:r>
+      <w:r>
+        <w:rPr>
+          <w:rStyle w:val="NormalTok"/>
+        </w:rPr>
+        <w:t xml:space="preserve"> push origin refs/tags/R261.108</w:t>
       </w:r>
     </w:p>
     <w:p>
@@ -1602,28 +1651,23 @@
         <w:pStyle w:val="FirstParagraph"/>
       </w:pPr>
       <w:r>
-        <w:t xml:space="preserve">Vor dem Taggen müssen Releaselinie, Mandant, gewünschter Lieferungstyp und der</w:t>
-      </w:r>
-      <w:r>
-        <w:t xml:space="preserve"> </w:t>
-      </w:r>
-      <w:r>
-        <w:t xml:space="preserve">exakte Commit auf</w:t>
-      </w:r>
-      <w:r>
-        <w:t xml:space="preserve"> </w:t>
-      </w:r>
-      <w:r>
-        <w:rPr>
-          <w:rStyle w:val="VerbatimChar"/>
-        </w:rPr>
-        <w:t xml:space="preserve">&lt;Releaselinie&gt;/Bereitstellung</w:t>
-      </w:r>
-      <w:r>
-        <w:t xml:space="preserve"> </w:t>
-      </w:r>
-      <w:r>
-        <w:t xml:space="preserve">fachlich bestätigt sein.</w:t>
+        <w:t xml:space="preserve">Danach unter</w:t>
+      </w:r>
+      <w:r>
+        <w:t xml:space="preserve"> </w:t>
+      </w:r>
+      <w:r>
+        <w:rPr>
+          <w:b/>
+          <w:bCs/>
+        </w:rPr>
+        <w:t xml:space="preserve">Actions → Build and publish release</w:t>
+      </w:r>
+      <w:r>
+        <w:t xml:space="preserve"> </w:t>
+      </w:r>
+      <w:r>
+        <w:t xml:space="preserve">prüfen:</w:t>
       </w:r>
     </w:p>
     <w:p>
@@ -1638,19 +1682,40 @@
         <w:rPr>
           <w:rStyle w:val="VerbatimChar"/>
         </w:rPr>
-        <w:t xml:space="preserve">Rnnn.100</w:t>
-      </w:r>
-      <w:r>
-        <w:t xml:space="preserve"> </w:t>
-      </w:r>
-      <w:r>
-        <w:t xml:space="preserve">erzeugt ein FULL mit dem vollständigen Stand jedes Projekts der</w:t>
-      </w:r>
-      <w:r>
-        <w:t xml:space="preserve"> </w:t>
-      </w:r>
-      <w:r>
-        <w:t xml:space="preserve">Delivery-Allowlist.</w:t>
+        <w:t xml:space="preserve">Build FULL or DELTA artifact</w:t>
+      </w:r>
+      <w:r>
+        <w:t xml:space="preserve"> </w:t>
+      </w:r>
+      <w:r>
+        <w:t xml:space="preserve">validiert Konfiguration, Tag und</w:t>
+      </w:r>
+      <w:r>
+        <w:t xml:space="preserve"> </w:t>
+      </w:r>
+      <w:r>
+        <w:t xml:space="preserve">Branchzuordnung, baut die Pakete und erzeugt</w:t>
+      </w:r>
+      <w:r>
+        <w:t xml:space="preserve"> </w:t>
+      </w:r>
+      <w:r>
+        <w:rPr>
+          <w:rStyle w:val="VerbatimChar"/>
+        </w:rPr>
+        <w:t xml:space="preserve">manifest.json</w:t>
+      </w:r>
+      <w:r>
+        <w:t xml:space="preserve"> </w:t>
+      </w:r>
+      <w:r>
+        <w:t xml:space="preserve">mit</w:t>
+      </w:r>
+      <w:r>
+        <w:t xml:space="preserve"> </w:t>
+      </w:r>
+      <w:r>
+        <w:t xml:space="preserve">SHA-256-Prüfsummen.</w:t>
       </w:r>
     </w:p>
     <w:p>
@@ -1662,7 +1727,7 @@
         </w:numPr>
       </w:pPr>
       <w:r>
-        <w:t xml:space="preserve">Jede andere gültige dreistellige Endung, zum Beispiel</w:t>
+        <w:t xml:space="preserve">Das Artefakt heißt</w:t>
       </w:r>
       <w:r>
         <w:t xml:space="preserve"> </w:t>
@@ -1671,31 +1736,19 @@
         <w:rPr>
           <w:rStyle w:val="VerbatimChar"/>
         </w:rPr>
-        <w:t xml:space="preserve">R261.108</w:t>
-      </w:r>
-      <w:r>
-        <w:t xml:space="preserve">, erzeugt</w:t>
-      </w:r>
-      <w:r>
-        <w:t xml:space="preserve"> </w:t>
-      </w:r>
-      <w:r>
-        <w:t xml:space="preserve">ein kumulatives DELTA von</w:t>
-      </w:r>
-      <w:r>
-        <w:t xml:space="preserve"> </w:t>
-      </w:r>
-      <w:r>
-        <w:rPr>
-          <w:rStyle w:val="VerbatimChar"/>
-        </w:rPr>
-        <w:t xml:space="preserve">R261.100</w:t>
-      </w:r>
-      <w:r>
-        <w:t xml:space="preserve"> </w:t>
-      </w:r>
-      <w:r>
-        <w:t xml:space="preserve">bis zum Zieltag.</w:t>
+        <w:t xml:space="preserve">&lt;Repository&gt;-&lt;Release-Tag&gt;</w:t>
+      </w:r>
+      <w:r>
+        <w:t xml:space="preserve"> </w:t>
+      </w:r>
+      <w:r>
+        <w:t xml:space="preserve">und wird standardmäßig</w:t>
+      </w:r>
+      <w:r>
+        <w:t xml:space="preserve"> </w:t>
+      </w:r>
+      <w:r>
+        <w:t xml:space="preserve">30 Tage aufbewahrt.</w:t>
       </w:r>
     </w:p>
     <w:p>
@@ -1707,25 +1760,55 @@
         </w:numPr>
       </w:pPr>
       <w:r>
-        <w:t xml:space="preserve">Ein DELTA setzt voraus, dass der</w:t>
-      </w:r>
-      <w:r>
-        <w:t xml:space="preserve"> </w:t>
-      </w:r>
-      <w:r>
         <w:rPr>
           <w:rStyle w:val="VerbatimChar"/>
         </w:rPr>
-        <w:t xml:space="preserve">.100</w:t>
-      </w:r>
-      <w:r>
-        <w:t xml:space="preserve">-Tag derselben Linie vorhanden und</w:t>
-      </w:r>
-      <w:r>
-        <w:t xml:space="preserve"> </w:t>
-      </w:r>
-      <w:r>
-        <w:t xml:space="preserve">erreichbar ist.</w:t>
+        <w:t xml:space="preserve">Verify and hand over artifact to Mainframe</w:t>
+      </w:r>
+      <w:r>
+        <w:t xml:space="preserve"> </w:t>
+      </w:r>
+      <w:r>
+        <w:t xml:space="preserve">wartet im Environment</w:t>
+      </w:r>
+      <w:r>
+        <w:t xml:space="preserve"> </w:t>
+      </w:r>
+      <w:r>
+        <w:rPr>
+          <w:rStyle w:val="VerbatimChar"/>
+        </w:rPr>
+        <w:t xml:space="preserve">Bereitstellung</w:t>
+      </w:r>
+      <w:r>
+        <w:t xml:space="preserve"> </w:t>
+      </w:r>
+      <w:r>
+        <w:t xml:space="preserve">auf die eingerichtete manuelle Freigabe.</w:t>
+      </w:r>
+    </w:p>
+    <w:p>
+      <w:pPr>
+        <w:pStyle w:val="Compact"/>
+        <w:numPr>
+          <w:ilvl w:val="0"/>
+          <w:numId w:val="1006"/>
+        </w:numPr>
+      </w:pPr>
+      <w:r>
+        <w:t xml:space="preserve">Nach der Freigabe werden Manifest und Prüfsummen erneut geprüft, JCL wird</w:t>
+      </w:r>
+      <w:r>
+        <w:t xml:space="preserve"> </w:t>
+      </w:r>
+      <w:r>
+        <w:t xml:space="preserve">aus dem versionierten Template gerendert und Paket plus JCL werden per</w:t>
+      </w:r>
+      <w:r>
+        <w:t xml:space="preserve"> </w:t>
+      </w:r>
+      <w:r>
+        <w:t xml:space="preserve">FTP/JES übergeben.</w:t>
       </w:r>
     </w:p>
     <w:p>
@@ -1733,84 +1816,47 @@
         <w:pStyle w:val="FirstParagraph"/>
       </w:pPr>
       <w:r>
-        <w:t xml:space="preserve">Zum Auslösen einen einfachen Git-Tag auf dem bestätigten Bereitstellungscommit</w:t>
-      </w:r>
-      <w:r>
-        <w:t xml:space="preserve"> </w:t>
-      </w:r>
-      <w:r>
-        <w:t xml:space="preserve">setzen und pushen, zum Beispiel:</w:t>
-      </w:r>
-    </w:p>
-    <w:p>
-      <w:pPr>
-        <w:pStyle w:val="SourceCode"/>
-      </w:pPr>
-      <w:r>
-        <w:rPr>
-          <w:rStyle w:val="FunctionTok"/>
-        </w:rPr>
-        <w:t xml:space="preserve">git</w:t>
-      </w:r>
-      <w:r>
-        <w:rPr>
-          <w:rStyle w:val="NormalTok"/>
-        </w:rPr>
-        <w:t xml:space="preserve"> fetch origin R261/Bereitstellung </w:t>
-      </w:r>
-      <w:r>
-        <w:rPr>
-          <w:rStyle w:val="AttributeTok"/>
-        </w:rPr>
-        <w:t xml:space="preserve">--tags</w:t>
-      </w:r>
-      <w:r>
-        <w:br/>
-      </w:r>
-      <w:r>
-        <w:rPr>
-          <w:rStyle w:val="FunctionTok"/>
-        </w:rPr>
-        <w:t xml:space="preserve">git</w:t>
-      </w:r>
-      <w:r>
-        <w:rPr>
-          <w:rStyle w:val="NormalTok"/>
-        </w:rPr>
-        <w:t xml:space="preserve"> tag R261.108 </w:t>
-      </w:r>
-      <w:r>
-        <w:rPr>
-          <w:rStyle w:val="OperatorTok"/>
-        </w:rPr>
-        <w:t xml:space="preserve">&lt;</w:t>
-      </w:r>
-      <w:r>
-        <w:rPr>
-          <w:rStyle w:val="NormalTok"/>
-        </w:rPr>
-        <w:t xml:space="preserve">vollständiger-commit-sha</w:t>
-      </w:r>
-      <w:r>
-        <w:rPr>
-          <w:rStyle w:val="OperatorTok"/>
-        </w:rPr>
-        <w:t xml:space="preserve">&gt;</w:t>
-      </w:r>
-      <w:r>
-        <w:br/>
-      </w:r>
-      <w:r>
-        <w:rPr>
-          <w:rStyle w:val="FunctionTok"/>
-        </w:rPr>
-        <w:t xml:space="preserve">git</w:t>
-      </w:r>
-      <w:r>
-        <w:rPr>
-          <w:rStyle w:val="NormalTok"/>
-        </w:rPr>
-        <w:t xml:space="preserve"> push origin refs/tags/R261.108</w:t>
+        <w:rPr>
+          <w:rStyle w:val="VerbatimChar"/>
+        </w:rPr>
+        <w:t xml:space="preserve">MAINFRAME_SUBMITTED</w:t>
+      </w:r>
+      <w:r>
+        <w:t xml:space="preserve"> </w:t>
+      </w:r>
+      <w:r>
+        <w:t xml:space="preserve">bedeutet ausschließlich, dass die unmittelbare</w:t>
+      </w:r>
+      <w:r>
+        <w:t xml:space="preserve"> </w:t>
+      </w:r>
+      <w:r>
+        <w:t xml:space="preserve">FTP-/JES-Übergabe akzeptiert wurde. Der fachliche Abschluss des Mainframe-Jobs</w:t>
+      </w:r>
+      <w:r>
+        <w:t xml:space="preserve"> </w:t>
+      </w:r>
+      <w:r>
+        <w:t xml:space="preserve">wird in Ausbaustufe 1 nicht abgefragt.</w:t>
+      </w:r>
+    </w:p>
+    <w:bookmarkEnd w:id="19"/>
+    <w:bookmarkStart w:id="22" w:name="X3ab85b391d33e6582e4da306fb3dd48ec8db851"/>
+    <w:p>
+      <w:pPr>
+        <w:pStyle w:val="Heading2"/>
+      </w:pPr>
+      <w:r>
+        <w:t xml:space="preserve">8. Einen Lauf kontrolliert wiederholen</w:t>
+      </w:r>
+    </w:p>
+    <w:bookmarkStart w:id="20" w:name="mtext-synchronisation-wiederholen"/>
+    <w:p>
+      <w:pPr>
+        <w:pStyle w:val="Heading3"/>
+      </w:pPr>
+      <w:r>
+        <w:t xml:space="preserve">M/Text-Synchronisation wiederholen</w:t>
       </w:r>
     </w:p>
     <w:p>
@@ -1818,7 +1864,7 @@
         <w:pStyle w:val="FirstParagraph"/>
       </w:pPr>
       <w:r>
-        <w:t xml:space="preserve">Danach unter</w:t>
+        <w:t xml:space="preserve">Unter</w:t>
       </w:r>
       <w:r>
         <w:t xml:space="preserve"> </w:t>
@@ -1828,13 +1874,13 @@
           <w:b/>
           <w:bCs/>
         </w:rPr>
-        <w:t xml:space="preserve">Actions → Build and publish release</w:t>
-      </w:r>
-      <w:r>
-        <w:t xml:space="preserve"> </w:t>
-      </w:r>
-      <w:r>
-        <w:t xml:space="preserve">prüfen:</w:t>
+        <w:t xml:space="preserve">Actions → Sync M/Text resources → Run workflow</w:t>
+      </w:r>
+      <w:r>
+        <w:t xml:space="preserve"> </w:t>
+      </w:r>
+      <w:r>
+        <w:t xml:space="preserve">angeben:</w:t>
       </w:r>
     </w:p>
     <w:p>
@@ -1849,34 +1895,10 @@
         <w:rPr>
           <w:rStyle w:val="VerbatimChar"/>
         </w:rPr>
-        <w:t xml:space="preserve">Build FULL or DELTA artifact</w:t>
-      </w:r>
-      <w:r>
-        <w:t xml:space="preserve"> </w:t>
-      </w:r>
-      <w:r>
-        <w:t xml:space="preserve">validiert Tag und Branchzuordnung, baut die</w:t>
-      </w:r>
-      <w:r>
-        <w:t xml:space="preserve"> </w:t>
-      </w:r>
-      <w:r>
-        <w:t xml:space="preserve">Pakete und erzeugt</w:t>
-      </w:r>
-      <w:r>
-        <w:t xml:space="preserve"> </w:t>
-      </w:r>
-      <w:r>
-        <w:rPr>
-          <w:rStyle w:val="VerbatimChar"/>
-        </w:rPr>
-        <w:t xml:space="preserve">manifest.json</w:t>
-      </w:r>
-      <w:r>
-        <w:t xml:space="preserve"> </w:t>
-      </w:r>
-      <w:r>
-        <w:t xml:space="preserve">mit SHA-256-Prüfsummen.</w:t>
+        <w:t xml:space="preserve">commit_sha</w:t>
+      </w:r>
+      <w:r>
+        <w:t xml:space="preserve">: vollständiger 40-stelliger SHA des bereits geprüften Commits;</w:t>
       </w:r>
     </w:p>
     <w:p>
@@ -1885,189 +1907,6 @@
         <w:numPr>
           <w:ilvl w:val="0"/>
           <w:numId w:val="1007"/>
-        </w:numPr>
-      </w:pPr>
-      <w:r>
-        <w:t xml:space="preserve">Das Artefakt heißt</w:t>
-      </w:r>
-      <w:r>
-        <w:t xml:space="preserve"> </w:t>
-      </w:r>
-      <w:r>
-        <w:rPr>
-          <w:rStyle w:val="VerbatimChar"/>
-        </w:rPr>
-        <w:t xml:space="preserve">&lt;Repository&gt;-&lt;Release-Tag&gt;</w:t>
-      </w:r>
-      <w:r>
-        <w:t xml:space="preserve"> </w:t>
-      </w:r>
-      <w:r>
-        <w:t xml:space="preserve">und wird standardmäßig</w:t>
-      </w:r>
-      <w:r>
-        <w:t xml:space="preserve"> </w:t>
-      </w:r>
-      <w:r>
-        <w:t xml:space="preserve">30 Tage aufbewahrt.</w:t>
-      </w:r>
-    </w:p>
-    <w:p>
-      <w:pPr>
-        <w:pStyle w:val="Compact"/>
-        <w:numPr>
-          <w:ilvl w:val="0"/>
-          <w:numId w:val="1007"/>
-        </w:numPr>
-      </w:pPr>
-      <w:r>
-        <w:rPr>
-          <w:rStyle w:val="VerbatimChar"/>
-        </w:rPr>
-        <w:t xml:space="preserve">Verify and hand over artifact to Mainframe</w:t>
-      </w:r>
-      <w:r>
-        <w:t xml:space="preserve"> </w:t>
-      </w:r>
-      <w:r>
-        <w:t xml:space="preserve">wartet im Environment</w:t>
-      </w:r>
-      <w:r>
-        <w:t xml:space="preserve"> </w:t>
-      </w:r>
-      <w:r>
-        <w:rPr>
-          <w:rStyle w:val="VerbatimChar"/>
-        </w:rPr>
-        <w:t xml:space="preserve">Bereitstellung</w:t>
-      </w:r>
-      <w:r>
-        <w:t xml:space="preserve"> </w:t>
-      </w:r>
-      <w:r>
-        <w:t xml:space="preserve">auf die eingerichtete manuelle Freigabe.</w:t>
-      </w:r>
-    </w:p>
-    <w:p>
-      <w:pPr>
-        <w:pStyle w:val="Compact"/>
-        <w:numPr>
-          <w:ilvl w:val="0"/>
-          <w:numId w:val="1007"/>
-        </w:numPr>
-      </w:pPr>
-      <w:r>
-        <w:t xml:space="preserve">Nach der Freigabe werden Manifest und Prüfsummen erneut geprüft, JCL wird</w:t>
-      </w:r>
-      <w:r>
-        <w:t xml:space="preserve"> </w:t>
-      </w:r>
-      <w:r>
-        <w:t xml:space="preserve">aus dem versionierten Template gerendert und Paket plus JCL werden per</w:t>
-      </w:r>
-      <w:r>
-        <w:t xml:space="preserve"> </w:t>
-      </w:r>
-      <w:r>
-        <w:t xml:space="preserve">FTP/JES übergeben.</w:t>
-      </w:r>
-    </w:p>
-    <w:p>
-      <w:pPr>
-        <w:pStyle w:val="FirstParagraph"/>
-      </w:pPr>
-      <w:r>
-        <w:rPr>
-          <w:rStyle w:val="VerbatimChar"/>
-        </w:rPr>
-        <w:t xml:space="preserve">MAINFRAME_SUBMITTED</w:t>
-      </w:r>
-      <w:r>
-        <w:t xml:space="preserve"> </w:t>
-      </w:r>
-      <w:r>
-        <w:t xml:space="preserve">bedeutet ausschließlich, dass die unmittelbare</w:t>
-      </w:r>
-      <w:r>
-        <w:t xml:space="preserve"> </w:t>
-      </w:r>
-      <w:r>
-        <w:t xml:space="preserve">FTP-/JES-Übergabe akzeptiert wurde. Der fachliche Abschluss des Mainframe-Jobs</w:t>
-      </w:r>
-      <w:r>
-        <w:t xml:space="preserve"> </w:t>
-      </w:r>
-      <w:r>
-        <w:t xml:space="preserve">wird in Ausbaustufe 1 nicht abgefragt.</w:t>
-      </w:r>
-    </w:p>
-    <w:bookmarkEnd w:id="19"/>
-    <w:bookmarkStart w:id="22" w:name="X3ab85b391d33e6582e4da306fb3dd48ec8db851"/>
-    <w:p>
-      <w:pPr>
-        <w:pStyle w:val="Heading2"/>
-      </w:pPr>
-      <w:r>
-        <w:t xml:space="preserve">8. Einen Lauf kontrolliert wiederholen</w:t>
-      </w:r>
-    </w:p>
-    <w:bookmarkStart w:id="20" w:name="mtext-synchronisation-wiederholen"/>
-    <w:p>
-      <w:pPr>
-        <w:pStyle w:val="Heading3"/>
-      </w:pPr>
-      <w:r>
-        <w:t xml:space="preserve">M/Text-Synchronisation wiederholen</w:t>
-      </w:r>
-    </w:p>
-    <w:p>
-      <w:pPr>
-        <w:pStyle w:val="FirstParagraph"/>
-      </w:pPr>
-      <w:r>
-        <w:t xml:space="preserve">Unter</w:t>
-      </w:r>
-      <w:r>
-        <w:t xml:space="preserve"> </w:t>
-      </w:r>
-      <w:r>
-        <w:rPr>
-          <w:b/>
-          <w:bCs/>
-        </w:rPr>
-        <w:t xml:space="preserve">Actions → Sync M/Text resources → Run workflow</w:t>
-      </w:r>
-      <w:r>
-        <w:t xml:space="preserve"> </w:t>
-      </w:r>
-      <w:r>
-        <w:t xml:space="preserve">angeben:</w:t>
-      </w:r>
-    </w:p>
-    <w:p>
-      <w:pPr>
-        <w:pStyle w:val="Compact"/>
-        <w:numPr>
-          <w:ilvl w:val="0"/>
-          <w:numId w:val="1008"/>
-        </w:numPr>
-      </w:pPr>
-      <w:r>
-        <w:rPr>
-          <w:rStyle w:val="VerbatimChar"/>
-        </w:rPr>
-        <w:t xml:space="preserve">commit_sha</w:t>
-      </w:r>
-      <w:r>
-        <w:t xml:space="preserve">: vollständiger 40-stelliger SHA des bereits geprüften Commits;</w:t>
-      </w:r>
-    </w:p>
-    <w:p>
-      <w:pPr>
-        <w:pStyle w:val="Compact"/>
-        <w:numPr>
-          <w:ilvl w:val="0"/>
-          <w:numId w:val="1008"/>
         </w:numPr>
       </w:pPr>
       <w:r>
@@ -2311,18 +2150,33 @@
               <w:pStyle w:val="Compact"/>
             </w:pPr>
             <w:r>
-              <w:t xml:space="preserve">Aktivierungssperre des Entwurfs</w:t>
-            </w:r>
-          </w:p>
-        </w:tc>
-        <w:tc>
-          <w:tcPr/>
-          <w:p>
-            <w:pPr>
-              <w:pStyle w:val="Compact"/>
-            </w:pPr>
-            <w:r>
-              <w:t xml:space="preserve">Freigegebenen zentralen Commit erst nach den dokumentierten Abnahmen pinnen</w:t>
+              <w:t xml:space="preserve">Technischer Platzhalter ist noch eingetragen</w:t>
+            </w:r>
+          </w:p>
+        </w:tc>
+        <w:tc>
+          <w:tcPr/>
+          <w:p>
+            <w:pPr>
+              <w:pStyle w:val="Compact"/>
+            </w:pPr>
+            <w:r>
+              <w:t xml:space="preserve">Vorgesehenen vollständigen Commit-SHA von</w:t>
+            </w:r>
+            <w:r>
+              <w:t xml:space="preserve"> </w:t>
+            </w:r>
+            <w:r>
+              <w:rPr>
+                <w:rStyle w:val="VerbatimChar"/>
+              </w:rPr>
+              <w:t xml:space="preserve">mtext-actions</w:t>
+            </w:r>
+            <w:r>
+              <w:t xml:space="preserve"> </w:t>
+            </w:r>
+            <w:r>
+              <w:t xml:space="preserve">in beiden Workflows eintragen</w:t>
             </w:r>
           </w:p>
         </w:tc>
@@ -2349,18 +2203,18 @@
               <w:pStyle w:val="Compact"/>
             </w:pPr>
             <w:r>
-              <w:t xml:space="preserve">Input, Konfiguration, Schema, Branchrichtung, Vertrag oder JCL ungültig</w:t>
-            </w:r>
-          </w:p>
-        </w:tc>
-        <w:tc>
-          <w:tcPr/>
-          <w:p>
-            <w:pPr>
-              <w:pStyle w:val="Compact"/>
-            </w:pPr>
-            <w:r>
-              <w:t xml:space="preserve">Erste Fehlermeldung lesen; Branch-/Tagformat und Freigabeschalter prüfen</w:t>
+              <w:t xml:space="preserve">Input, Konfiguration, Schema, Branchrichtung oder JCL ungültig</w:t>
+            </w:r>
+          </w:p>
+        </w:tc>
+        <w:tc>
+          <w:tcPr/>
+          <w:p>
+            <w:pPr>
+              <w:pStyle w:val="Compact"/>
+            </w:pPr>
+            <w:r>
+              <w:t xml:space="preserve">Erste Fehlermeldung lesen; Branch-/Tagformat und Konfiguration prüfen</w:t>
             </w:r>
           </w:p>
         </w:tc>
@@ -2676,7 +2530,7 @@
               <w:pStyle w:val="Compact"/>
             </w:pPr>
             <w:r>
-              <w:t xml:space="preserve">Mainframe-Endstatus separat nach bestehendem Betriebsverfahren prüfen</w:t>
+              <w:t xml:space="preserve">Weiteren Status im Betriebsverfahren verfolgen</w:t>
             </w:r>
           </w:p>
         </w:tc>
@@ -2704,6 +2558,142 @@
       </w:pPr>
       <w:r>
         <w:t xml:space="preserve">10. Was Benutzer nicht tun dürfen</w:t>
+      </w:r>
+    </w:p>
+    <w:p>
+      <w:pPr>
+        <w:pStyle w:val="Compact"/>
+        <w:numPr>
+          <w:ilvl w:val="0"/>
+          <w:numId w:val="1008"/>
+        </w:numPr>
+      </w:pPr>
+      <w:r>
+        <w:t xml:space="preserve">keine direkten Pushes auf Stufenbranches erzwingen oder Schutzregeln</w:t>
+      </w:r>
+      <w:r>
+        <w:t xml:space="preserve"> </w:t>
+      </w:r>
+      <w:r>
+        <w:t xml:space="preserve">umgehen;</w:t>
+      </w:r>
+    </w:p>
+    <w:p>
+      <w:pPr>
+        <w:pStyle w:val="Compact"/>
+        <w:numPr>
+          <w:ilvl w:val="0"/>
+          <w:numId w:val="1008"/>
+        </w:numPr>
+      </w:pPr>
+      <w:r>
+        <w:t xml:space="preserve">keinen Tag auf einen Commit außerhalb des zugehörigen</w:t>
+      </w:r>
+      <w:r>
+        <w:t xml:space="preserve"> </w:t>
+      </w:r>
+      <w:r>
+        <w:rPr>
+          <w:rStyle w:val="VerbatimChar"/>
+        </w:rPr>
+        <w:t xml:space="preserve">Rnnn/Bereitstellung</w:t>
+      </w:r>
+      <w:r>
+        <w:t xml:space="preserve">-Branches setzen;</w:t>
+      </w:r>
+    </w:p>
+    <w:p>
+      <w:pPr>
+        <w:pStyle w:val="Compact"/>
+        <w:numPr>
+          <w:ilvl w:val="0"/>
+          <w:numId w:val="1008"/>
+        </w:numPr>
+      </w:pPr>
+      <w:r>
+        <w:t xml:space="preserve">bestehende Release-Tags nicht verschieben oder ohne abgestimmtes</w:t>
+      </w:r>
+      <w:r>
+        <w:t xml:space="preserve"> </w:t>
+      </w:r>
+      <w:r>
+        <w:t xml:space="preserve">Korrekturverfahren löschen und neu anlegen;</w:t>
+      </w:r>
+    </w:p>
+    <w:p>
+      <w:pPr>
+        <w:pStyle w:val="Compact"/>
+        <w:numPr>
+          <w:ilvl w:val="0"/>
+          <w:numId w:val="1008"/>
+        </w:numPr>
+      </w:pPr>
+      <w:r>
+        <w:t xml:space="preserve">keine URLs, Mandanten oder Zielsysteme als freie Workflowwerte einschleusen;</w:t>
+      </w:r>
+    </w:p>
+    <w:p>
+      <w:pPr>
+        <w:pStyle w:val="Compact"/>
+        <w:numPr>
+          <w:ilvl w:val="0"/>
+          <w:numId w:val="1008"/>
+        </w:numPr>
+      </w:pPr>
+      <w:r>
+        <w:t xml:space="preserve">die zentrale Workflowreferenz nicht auf einen beweglichen Branch oder Tag</w:t>
+      </w:r>
+      <w:r>
+        <w:t xml:space="preserve"> </w:t>
+      </w:r>
+      <w:r>
+        <w:t xml:space="preserve">umstellen;</w:t>
+      </w:r>
+    </w:p>
+    <w:p>
+      <w:pPr>
+        <w:pStyle w:val="Compact"/>
+        <w:numPr>
+          <w:ilvl w:val="0"/>
+          <w:numId w:val="1008"/>
+        </w:numPr>
+      </w:pPr>
+      <w:r>
+        <w:t xml:space="preserve">einen grünen Adapter- oder Mainframe-Übergabestatus nicht als fachlichen</w:t>
+      </w:r>
+      <w:r>
+        <w:t xml:space="preserve"> </w:t>
+      </w:r>
+      <w:r>
+        <w:t xml:space="preserve">Endstatus ausgeben;</w:t>
+      </w:r>
+    </w:p>
+    <w:p>
+      <w:pPr>
+        <w:pStyle w:val="Compact"/>
+        <w:numPr>
+          <w:ilvl w:val="0"/>
+          <w:numId w:val="1008"/>
+        </w:numPr>
+      </w:pPr>
+      <w:r>
+        <w:t xml:space="preserve">keine Änderungen mehr im alten Jenkins-/SVN-Prozess vornehmen, sobald der</w:t>
+      </w:r>
+      <w:r>
+        <w:t xml:space="preserve"> </w:t>
+      </w:r>
+      <w:r>
+        <w:t xml:space="preserve">produktive harte Cut erfolgt ist.</w:t>
+      </w:r>
+    </w:p>
+    <w:bookmarkEnd w:id="24"/>
+    <w:bookmarkStart w:id="26" w:name="Xdbe22807b2555cf0a6aeea1d1aac0f2d7b9397d"/>
+    <w:p>
+      <w:pPr>
+        <w:pStyle w:val="Heading2"/>
+      </w:pPr>
+      <w:r>
+        <w:t xml:space="preserve">11. Kurze Checkliste vor einem Release</w:t>
       </w:r>
     </w:p>
     <w:p>
@@ -2715,13 +2705,7 @@
         </w:numPr>
       </w:pPr>
       <w:r>
-        <w:t xml:space="preserve">keine direkten Pushes auf Stufenbranches erzwingen oder Schutzregeln</w:t>
-      </w:r>
-      <w:r>
-        <w:t xml:space="preserve"> </w:t>
-      </w:r>
-      <w:r>
-        <w:t xml:space="preserve">umgehen;</w:t>
+        <w:t xml:space="preserve">richtiger Mandant und richtige Releaselinie;</w:t>
       </w:r>
     </w:p>
     <w:p>
@@ -2733,19 +2717,7 @@
         </w:numPr>
       </w:pPr>
       <w:r>
-        <w:t xml:space="preserve">keinen Tag auf einen Commit außerhalb des zugehörigen</w:t>
-      </w:r>
-      <w:r>
-        <w:t xml:space="preserve"> </w:t>
-      </w:r>
-      <w:r>
-        <w:rPr>
-          <w:rStyle w:val="VerbatimChar"/>
-        </w:rPr>
-        <w:t xml:space="preserve">Rnnn/Bereitstellung</w:t>
-      </w:r>
-      <w:r>
-        <w:t xml:space="preserve">-Branches setzen;</w:t>
+        <w:t xml:space="preserve">gewünschte Commits fachlich in Abnahme bestätigt;</w:t>
       </w:r>
     </w:p>
     <w:p>
@@ -2757,13 +2729,7 @@
         </w:numPr>
       </w:pPr>
       <w:r>
-        <w:t xml:space="preserve">bestehende Release-Tags nicht verschieben oder ohne abgestimmtes</w:t>
-      </w:r>
-      <w:r>
-        <w:t xml:space="preserve"> </w:t>
-      </w:r>
-      <w:r>
-        <w:t xml:space="preserve">Korrekturverfahren löschen und neu anlegen;</w:t>
+        <w:t xml:space="preserve">freigegebene Commits direkt nach Bereitstellung übernommen;</w:t>
       </w:r>
     </w:p>
     <w:p>
@@ -2775,7 +2741,7 @@
         </w:numPr>
       </w:pPr>
       <w:r>
-        <w:t xml:space="preserve">keine URLs, Mandanten oder Zielsysteme als freie Workflowwerte einschleusen;</w:t>
+        <w:t xml:space="preserve">Ziel-Commit notiert und Tag noch nicht vorhanden;</w:t>
       </w:r>
     </w:p>
     <w:p>
@@ -2787,13 +2753,16 @@
         </w:numPr>
       </w:pPr>
       <w:r>
-        <w:t xml:space="preserve">Null-SHA oder Vertragsschalter nicht zur Fehlerbehebung eigenmächtig</w:t>
-      </w:r>
-      <w:r>
-        <w:t xml:space="preserve"> </w:t>
-      </w:r>
-      <w:r>
-        <w:t xml:space="preserve">aktivieren;</w:t>
+        <w:rPr>
+          <w:rStyle w:val="VerbatimChar"/>
+        </w:rPr>
+        <w:t xml:space="preserve">.100</w:t>
+      </w:r>
+      <w:r>
+        <w:t xml:space="preserve"> </w:t>
+      </w:r>
+      <w:r>
+        <w:t xml:space="preserve">vorhanden, wenn ein DELTA erzeugt werden soll;</w:t>
       </w:r>
     </w:p>
     <w:p>
@@ -2805,13 +2774,7 @@
         </w:numPr>
       </w:pPr>
       <w:r>
-        <w:t xml:space="preserve">einen grünen Adapter- oder Mainframe-Übergabestatus nicht als fachlichen</w:t>
-      </w:r>
-      <w:r>
-        <w:t xml:space="preserve"> </w:t>
-      </w:r>
-      <w:r>
-        <w:t xml:space="preserve">Endstatus ausgeben;</w:t>
+        <w:t xml:space="preserve">Build-Artefakt und Manifest erfolgreich;</w:t>
       </w:r>
     </w:p>
     <w:p>
@@ -2823,23 +2786,7 @@
         </w:numPr>
       </w:pPr>
       <w:r>
-        <w:t xml:space="preserve">keine Änderungen mehr im alten Jenkins-/SVN-Prozess vornehmen, sobald der</w:t>
-      </w:r>
-      <w:r>
-        <w:t xml:space="preserve"> </w:t>
-      </w:r>
-      <w:r>
-        <w:t xml:space="preserve">produktive harte Cut erfolgt ist.</w:t>
-      </w:r>
-    </w:p>
-    <w:bookmarkEnd w:id="24"/>
-    <w:bookmarkStart w:id="25" w:name="Xdbe22807b2555cf0a6aeea1d1aac0f2d7b9397d"/>
-    <w:p>
-      <w:pPr>
-        <w:pStyle w:val="Heading2"/>
-      </w:pPr>
-      <w:r>
-        <w:t xml:space="preserve">11. Kurze Checkliste vor einem Release</w:t>
+        <w:t xml:space="preserve">manuelle Mainframe-Freigabe durch berechtigte Person;</w:t>
       </w:r>
     </w:p>
     <w:p>
@@ -2847,115 +2794,10 @@
         <w:pStyle w:val="Compact"/>
         <w:numPr>
           <w:ilvl w:val="0"/>
-          <w:numId w:val="1010"/>
+          <w:numId w:val="1009"/>
         </w:numPr>
       </w:pPr>
       <w:r>
-        <w:t xml:space="preserve">richtiger Mandant und richtige Releaselinie;</w:t>
-      </w:r>
-    </w:p>
-    <w:p>
-      <w:pPr>
-        <w:pStyle w:val="Compact"/>
-        <w:numPr>
-          <w:ilvl w:val="0"/>
-          <w:numId w:val="1010"/>
-        </w:numPr>
-      </w:pPr>
-      <w:r>
-        <w:t xml:space="preserve">gewünschte Commits fachlich in Abnahme bestätigt;</w:t>
-      </w:r>
-    </w:p>
-    <w:p>
-      <w:pPr>
-        <w:pStyle w:val="Compact"/>
-        <w:numPr>
-          <w:ilvl w:val="0"/>
-          <w:numId w:val="1010"/>
-        </w:numPr>
-      </w:pPr>
-      <w:r>
-        <w:t xml:space="preserve">Auswahlbranch vom aktuellen Bereitstellungsstand erstellt;</w:t>
-      </w:r>
-    </w:p>
-    <w:p>
-      <w:pPr>
-        <w:pStyle w:val="Compact"/>
-        <w:numPr>
-          <w:ilvl w:val="0"/>
-          <w:numId w:val="1010"/>
-        </w:numPr>
-      </w:pPr>
-      <w:r>
-        <w:t xml:space="preserve">Pull Request nach Bereitstellung erfolgreich validiert und gemergt;</w:t>
-      </w:r>
-    </w:p>
-    <w:p>
-      <w:pPr>
-        <w:pStyle w:val="Compact"/>
-        <w:numPr>
-          <w:ilvl w:val="0"/>
-          <w:numId w:val="1010"/>
-        </w:numPr>
-      </w:pPr>
-      <w:r>
-        <w:t xml:space="preserve">Ziel-Commit notiert und Tag noch nicht vorhanden;</w:t>
-      </w:r>
-    </w:p>
-    <w:p>
-      <w:pPr>
-        <w:pStyle w:val="Compact"/>
-        <w:numPr>
-          <w:ilvl w:val="0"/>
-          <w:numId w:val="1010"/>
-        </w:numPr>
-      </w:pPr>
-      <w:r>
-        <w:rPr>
-          <w:rStyle w:val="VerbatimChar"/>
-        </w:rPr>
-        <w:t xml:space="preserve">.100</w:t>
-      </w:r>
-      <w:r>
-        <w:t xml:space="preserve"> </w:t>
-      </w:r>
-      <w:r>
-        <w:t xml:space="preserve">vorhanden, wenn ein DELTA erzeugt werden soll;</w:t>
-      </w:r>
-    </w:p>
-    <w:p>
-      <w:pPr>
-        <w:pStyle w:val="Compact"/>
-        <w:numPr>
-          <w:ilvl w:val="0"/>
-          <w:numId w:val="1010"/>
-        </w:numPr>
-      </w:pPr>
-      <w:r>
-        <w:t xml:space="preserve">Build-Artefakt und Manifest erfolgreich;</w:t>
-      </w:r>
-    </w:p>
-    <w:p>
-      <w:pPr>
-        <w:pStyle w:val="Compact"/>
-        <w:numPr>
-          <w:ilvl w:val="0"/>
-          <w:numId w:val="1010"/>
-        </w:numPr>
-      </w:pPr>
-      <w:r>
-        <w:t xml:space="preserve">manuelle Mainframe-Freigabe durch berechtigte Person;</w:t>
-      </w:r>
-    </w:p>
-    <w:p>
-      <w:pPr>
-        <w:pStyle w:val="Compact"/>
-        <w:numPr>
-          <w:ilvl w:val="0"/>
-          <w:numId w:val="1010"/>
-        </w:numPr>
-      </w:pPr>
-      <w:r>
         <w:t xml:space="preserve">unmittelbare Übergabe und nachgelagerter fachlicher Status getrennt</w:t>
       </w:r>
       <w:r>
@@ -2981,7 +2823,7 @@
       <w:r>
         <w:t xml:space="preserve"> </w:t>
       </w:r>
-      <w:hyperlink r:id="rId11">
+      <w:hyperlink r:id="rId25">
         <w:r>
           <w:rPr>
             <w:rStyle w:val="Hyperlink"/>
@@ -2993,8 +2835,8 @@
         <w:t xml:space="preserve">.</w:t>
       </w:r>
     </w:p>
-    <w:bookmarkEnd w:id="25"/>
     <w:bookmarkEnd w:id="26"/>
+    <w:bookmarkEnd w:id="27"/>
     <w:sectPr>
       <w:footnotePr>
         <w:numRestart w:val="eachSect"/>
@@ -3300,7 +3142,34 @@
     <w:abstractNumId w:val="991"/>
   </w:num>
   <w:num w:numId="1002">
-    <w:abstractNumId w:val="991"/>
+    <w:abstractNumId w:val="99411"/>
+    <w:lvlOverride w:ilvl="0">
+      <w:startOverride w:val="1"/>
+    </w:lvlOverride>
+    <w:lvlOverride w:ilvl="1">
+      <w:startOverride w:val="1"/>
+    </w:lvlOverride>
+    <w:lvlOverride w:ilvl="2">
+      <w:startOverride w:val="1"/>
+    </w:lvlOverride>
+    <w:lvlOverride w:ilvl="3">
+      <w:startOverride w:val="1"/>
+    </w:lvlOverride>
+    <w:lvlOverride w:ilvl="4">
+      <w:startOverride w:val="1"/>
+    </w:lvlOverride>
+    <w:lvlOverride w:ilvl="5">
+      <w:startOverride w:val="1"/>
+    </w:lvlOverride>
+    <w:lvlOverride w:ilvl="6">
+      <w:startOverride w:val="1"/>
+    </w:lvlOverride>
+    <w:lvlOverride w:ilvl="7">
+      <w:startOverride w:val="1"/>
+    </w:lvlOverride>
+    <w:lvlOverride w:ilvl="8">
+      <w:startOverride w:val="1"/>
+    </w:lvlOverride>
   </w:num>
   <w:num w:numId="1003">
     <w:abstractNumId w:val="99411"/>
@@ -3363,6 +3232,9 @@
     </w:lvlOverride>
   </w:num>
   <w:num w:numId="1005">
+    <w:abstractNumId w:val="991"/>
+  </w:num>
+  <w:num w:numId="1006">
     <w:abstractNumId w:val="99411"/>
     <w:lvlOverride w:ilvl="0">
       <w:startOverride w:val="1"/>
@@ -3392,46 +3264,13 @@
       <w:startOverride w:val="1"/>
     </w:lvlOverride>
   </w:num>
-  <w:num w:numId="1006">
+  <w:num w:numId="1007">
     <w:abstractNumId w:val="991"/>
-  </w:num>
-  <w:num w:numId="1007">
-    <w:abstractNumId w:val="99411"/>
-    <w:lvlOverride w:ilvl="0">
-      <w:startOverride w:val="1"/>
-    </w:lvlOverride>
-    <w:lvlOverride w:ilvl="1">
-      <w:startOverride w:val="1"/>
-    </w:lvlOverride>
-    <w:lvlOverride w:ilvl="2">
-      <w:startOverride w:val="1"/>
-    </w:lvlOverride>
-    <w:lvlOverride w:ilvl="3">
-      <w:startOverride w:val="1"/>
-    </w:lvlOverride>
-    <w:lvlOverride w:ilvl="4">
-      <w:startOverride w:val="1"/>
-    </w:lvlOverride>
-    <w:lvlOverride w:ilvl="5">
-      <w:startOverride w:val="1"/>
-    </w:lvlOverride>
-    <w:lvlOverride w:ilvl="6">
-      <w:startOverride w:val="1"/>
-    </w:lvlOverride>
-    <w:lvlOverride w:ilvl="7">
-      <w:startOverride w:val="1"/>
-    </w:lvlOverride>
-    <w:lvlOverride w:ilvl="8">
-      <w:startOverride w:val="1"/>
-    </w:lvlOverride>
   </w:num>
   <w:num w:numId="1008">
     <w:abstractNumId w:val="991"/>
   </w:num>
   <w:num w:numId="1009">
-    <w:abstractNumId w:val="991"/>
-  </w:num>
-  <w:num w:numId="1010">
     <w:abstractNumId w:val="991"/>
   </w:num>
 </w:numbering>

</xml_diff>